<commit_message>
deleted:    "docs/\350\256\272\346\226\207\347\261\273/\346\255\243\346\226\207/~$\346\255\243\346\226\207-V3.3\346\234\237\345\210\212\347\211\210-\346\234\237\345\210\212\346\216\222\347\211\210.docx" 	modified:   "docs/\350\256\272\346\226\207\347\261\273/\346\255\243\346\226\207/\350\256\272\346\226\207\346\255\243\346\226\207-V3.3\346\234\237\345\210\212\347\211\210-\346\234\237\345\210\212\346\216\222\347\211\210.docx"
</commit_message>
<xml_diff>
--- a/docs/论文类/正文/论文正文-V3.3期刊版-期刊排版.docx
+++ b/docs/论文类/正文/论文正文-V3.3期刊版-期刊排版.docx
@@ -4,31 +4,6 @@
   <w:body>
     <w:p>
       <w:pPr>
-        <w:pStyle w:val="4"/>
-        <w:spacing w:before="240" w:after="240" w:line="360" w:lineRule="auto"/>
-        <w:jc w:val="center"/>
-        <w:rPr>
-          <w:rFonts w:ascii="Times New Roman" w:hAnsi="Times New Roman" w:eastAsia="黑体" w:cs="Times New Roman"/>
-          <w:i w:val="0"/>
-          <w:iCs w:val="0"/>
-          <w:color w:val="auto"/>
-        </w:rPr>
-      </w:pPr>
-      <w:bookmarkStart w:id="0" w:name="题目"/>
-      <w:r>
-        <w:rPr>
-          <w:rFonts w:ascii="Times New Roman" w:hAnsi="Times New Roman" w:eastAsia="黑体" w:cs="Times New Roman"/>
-          <w:b/>
-          <w:i w:val="0"/>
-          <w:iCs w:val="0"/>
-          <w:color w:val="auto"/>
-          <w:sz w:val="28"/>
-        </w:rPr>
-        <w:t>题目</w:t>
-      </w:r>
-    </w:p>
-    <w:p>
-      <w:pPr>
         <w:pStyle w:val="23"/>
         <w:spacing w:before="240" w:after="240" w:line="360" w:lineRule="auto"/>
         <w:jc w:val="center"/>
@@ -39,6 +14,7 @@
           <w:color w:val="auto"/>
         </w:rPr>
       </w:pPr>
+      <w:bookmarkStart w:id="0" w:name="题目"/>
       <w:r>
         <w:rPr>
           <w:rFonts w:ascii="Times New Roman" w:hAnsi="Times New Roman" w:eastAsia="黑体" w:cs="Times New Roman"/>
@@ -55,7 +31,7 @@
       <w:pPr>
         <w:pStyle w:val="4"/>
         <w:spacing w:before="240" w:after="240" w:line="360" w:lineRule="auto"/>
-        <w:jc w:val="center"/>
+        <w:jc w:val="left"/>
         <w:rPr>
           <w:rFonts w:ascii="Times New Roman" w:hAnsi="Times New Roman" w:eastAsia="黑体" w:cs="Times New Roman"/>
           <w:i w:val="0"/>
@@ -81,7 +57,7 @@
         <w:pStyle w:val="23"/>
         <w:spacing w:before="0" w:after="0" w:line="360" w:lineRule="auto"/>
         <w:ind w:firstLineChars="200"/>
-        <w:jc w:val="both"/>
+        <w:jc w:val="left"/>
         <w:rPr>
           <w:rFonts w:ascii="Times New Roman" w:hAnsi="Times New Roman" w:eastAsia="宋体" w:cs="Times New Roman"/>
           <w:i w:val="0"/>
@@ -105,7 +81,7 @@
         <w:pStyle w:val="3"/>
         <w:spacing w:before="0" w:after="0" w:line="360" w:lineRule="auto"/>
         <w:ind w:firstLineChars="200"/>
-        <w:jc w:val="both"/>
+        <w:jc w:val="left"/>
         <w:rPr>
           <w:rFonts w:ascii="Times New Roman" w:hAnsi="Times New Roman" w:eastAsia="宋体" w:cs="Times New Roman"/>
           <w:i w:val="0"/>
@@ -156,7 +132,7 @@
           <w:sz w:val="21"/>
         </w:rPr>
         <w:pict>
-          <v:rect id="_x0000_i1025" o:spt="1" style="height:1.5pt;width:0pt;" coordsize="21600,21600" o:hr="t" o:hrstd="t" o:hralign="center">
+          <v:rect id="_x0000_i1025" o:spt="1" style="height:1.5pt;width:0pt;" coordsize="21600,21600" o:hr="t" o:hrstd="t">
             <v:path/>
             <v:fill focussize="0,0"/>
             <v:stroke/>
@@ -173,7 +149,7 @@
       <w:pPr>
         <w:pStyle w:val="4"/>
         <w:spacing w:before="240" w:after="240" w:line="360" w:lineRule="auto"/>
-        <w:jc w:val="center"/>
+        <w:jc w:val="left"/>
         <w:rPr>
           <w:rFonts w:ascii="Times New Roman" w:hAnsi="Times New Roman" w:eastAsia="黑体" w:cs="Times New Roman"/>
           <w:i w:val="0"/>
@@ -224,7 +200,7 @@
         <w:pStyle w:val="23"/>
         <w:spacing w:before="0" w:after="0" w:line="360" w:lineRule="auto"/>
         <w:ind w:firstLineChars="200"/>
-        <w:jc w:val="both"/>
+        <w:jc w:val="left"/>
         <w:rPr>
           <w:rFonts w:ascii="Times New Roman" w:hAnsi="Times New Roman" w:eastAsia="宋体" w:cs="Times New Roman"/>
           <w:i w:val="0"/>
@@ -274,7 +250,7 @@
         <w:pStyle w:val="23"/>
         <w:spacing w:before="0" w:after="0" w:line="360" w:lineRule="auto"/>
         <w:ind w:firstLineChars="200"/>
-        <w:jc w:val="both"/>
+        <w:jc w:val="left"/>
         <w:rPr>
           <w:rFonts w:ascii="Times New Roman" w:hAnsi="Times New Roman" w:eastAsia="宋体" w:cs="Times New Roman"/>
           <w:i w:val="0"/>
@@ -324,7 +300,7 @@
         <w:pStyle w:val="23"/>
         <w:spacing w:before="0" w:after="0" w:line="360" w:lineRule="auto"/>
         <w:ind w:firstLineChars="200"/>
-        <w:jc w:val="both"/>
+        <w:jc w:val="left"/>
         <w:rPr>
           <w:rFonts w:ascii="Times New Roman" w:hAnsi="Times New Roman" w:eastAsia="宋体" w:cs="Times New Roman"/>
           <w:i w:val="0"/>
@@ -374,7 +350,7 @@
         <w:pStyle w:val="23"/>
         <w:spacing w:before="0" w:after="0" w:line="360" w:lineRule="auto"/>
         <w:ind w:firstLineChars="200"/>
-        <w:jc w:val="both"/>
+        <w:jc w:val="left"/>
         <w:rPr>
           <w:rFonts w:ascii="Times New Roman" w:hAnsi="Times New Roman" w:eastAsia="宋体" w:cs="Times New Roman"/>
           <w:i w:val="0"/>
@@ -398,7 +374,7 @@
         <w:pStyle w:val="3"/>
         <w:spacing w:before="0" w:after="0" w:line="360" w:lineRule="auto"/>
         <w:ind w:firstLineChars="200"/>
-        <w:jc w:val="both"/>
+        <w:jc w:val="left"/>
         <w:rPr>
           <w:rFonts w:ascii="Times New Roman" w:hAnsi="Times New Roman" w:eastAsia="宋体" w:cs="Times New Roman"/>
           <w:i w:val="0"/>
@@ -422,7 +398,7 @@
         <w:pStyle w:val="3"/>
         <w:spacing w:before="0" w:after="0" w:line="360" w:lineRule="auto"/>
         <w:ind w:firstLineChars="200"/>
-        <w:jc w:val="both"/>
+        <w:jc w:val="left"/>
         <w:rPr>
           <w:rFonts w:ascii="Times New Roman" w:hAnsi="Times New Roman" w:eastAsia="宋体" w:cs="Times New Roman"/>
           <w:i w:val="0"/>
@@ -446,7 +422,7 @@
         <w:pStyle w:val="3"/>
         <w:spacing w:before="0" w:after="0" w:line="360" w:lineRule="auto"/>
         <w:ind w:firstLineChars="200"/>
-        <w:jc w:val="both"/>
+        <w:jc w:val="left"/>
         <w:rPr>
           <w:rFonts w:ascii="Times New Roman" w:hAnsi="Times New Roman" w:eastAsia="宋体" w:cs="Times New Roman"/>
           <w:i w:val="0"/>
@@ -470,7 +446,7 @@
         <w:pStyle w:val="3"/>
         <w:spacing w:before="0" w:after="0" w:line="360" w:lineRule="auto"/>
         <w:ind w:firstLineChars="200"/>
-        <w:jc w:val="both"/>
+        <w:jc w:val="left"/>
         <w:rPr>
           <w:rFonts w:ascii="Times New Roman" w:hAnsi="Times New Roman" w:eastAsia="宋体" w:cs="Times New Roman"/>
           <w:i w:val="0"/>
@@ -494,7 +470,7 @@
         <w:pStyle w:val="3"/>
         <w:spacing w:before="0" w:after="0" w:line="360" w:lineRule="auto"/>
         <w:ind w:firstLineChars="200"/>
-        <w:jc w:val="both"/>
+        <w:jc w:val="left"/>
         <w:rPr>
           <w:rFonts w:ascii="Times New Roman" w:hAnsi="Times New Roman" w:eastAsia="宋体" w:cs="Times New Roman"/>
           <w:i w:val="0"/>
@@ -544,7 +520,7 @@
         <w:pStyle w:val="23"/>
         <w:spacing w:before="0" w:after="0" w:line="360" w:lineRule="auto"/>
         <w:ind w:firstLineChars="200"/>
-        <w:jc w:val="both"/>
+        <w:jc w:val="left"/>
         <w:rPr>
           <w:rFonts w:ascii="Times New Roman" w:hAnsi="Times New Roman" w:eastAsia="宋体" w:cs="Times New Roman"/>
           <w:i w:val="0"/>
@@ -568,7 +544,7 @@
         <w:pStyle w:val="3"/>
         <w:spacing w:before="0" w:after="0" w:line="360" w:lineRule="auto"/>
         <w:ind w:firstLineChars="200"/>
-        <w:jc w:val="both"/>
+        <w:jc w:val="left"/>
         <w:rPr>
           <w:rFonts w:ascii="Times New Roman" w:hAnsi="Times New Roman" w:eastAsia="宋体" w:cs="Times New Roman"/>
           <w:i w:val="0"/>
@@ -592,7 +568,7 @@
         <w:pStyle w:val="3"/>
         <w:spacing w:before="0" w:after="0" w:line="360" w:lineRule="auto"/>
         <w:ind w:firstLineChars="200"/>
-        <w:jc w:val="both"/>
+        <w:jc w:val="left"/>
         <w:rPr>
           <w:rFonts w:ascii="Times New Roman" w:hAnsi="Times New Roman" w:eastAsia="宋体" w:cs="Times New Roman"/>
           <w:i w:val="0"/>
@@ -642,7 +618,7 @@
         <w:pStyle w:val="23"/>
         <w:spacing w:before="0" w:after="0" w:line="360" w:lineRule="auto"/>
         <w:ind w:firstLineChars="200"/>
-        <w:jc w:val="both"/>
+        <w:jc w:val="left"/>
         <w:rPr>
           <w:rFonts w:ascii="Times New Roman" w:hAnsi="Times New Roman" w:eastAsia="宋体" w:cs="Times New Roman"/>
           <w:i w:val="0"/>
@@ -692,7 +668,7 @@
         <w:pStyle w:val="23"/>
         <w:spacing w:before="0" w:after="0" w:line="360" w:lineRule="auto"/>
         <w:ind w:firstLineChars="200"/>
-        <w:jc w:val="both"/>
+        <w:jc w:val="left"/>
         <w:rPr>
           <w:rFonts w:ascii="Times New Roman" w:hAnsi="Times New Roman" w:eastAsia="宋体" w:cs="Times New Roman"/>
           <w:i w:val="0"/>
@@ -716,7 +692,7 @@
         <w:pStyle w:val="3"/>
         <w:spacing w:before="0" w:after="0" w:line="360" w:lineRule="auto"/>
         <w:ind w:firstLineChars="200"/>
-        <w:jc w:val="both"/>
+        <w:jc w:val="left"/>
         <w:rPr>
           <w:rFonts w:ascii="Times New Roman" w:hAnsi="Times New Roman" w:eastAsia="宋体" w:cs="Times New Roman"/>
           <w:i w:val="0"/>
@@ -740,7 +716,7 @@
         <w:pStyle w:val="3"/>
         <w:spacing w:before="0" w:after="0" w:line="360" w:lineRule="auto"/>
         <w:ind w:firstLineChars="200"/>
-        <w:jc w:val="both"/>
+        <w:jc w:val="left"/>
         <w:rPr>
           <w:rFonts w:ascii="Times New Roman" w:hAnsi="Times New Roman" w:eastAsia="宋体" w:cs="Times New Roman"/>
           <w:i w:val="0"/>
@@ -764,7 +740,7 @@
         <w:pStyle w:val="3"/>
         <w:spacing w:before="0" w:after="0" w:line="360" w:lineRule="auto"/>
         <w:ind w:firstLineChars="200"/>
-        <w:jc w:val="both"/>
+        <w:jc w:val="left"/>
         <w:rPr>
           <w:rFonts w:ascii="Times New Roman" w:hAnsi="Times New Roman" w:eastAsia="宋体" w:cs="Times New Roman"/>
           <w:i w:val="0"/>
@@ -803,7 +779,7 @@
           <w:sz w:val="21"/>
         </w:rPr>
         <w:pict>
-          <v:rect id="_x0000_i1026" o:spt="1" style="height:1.5pt;width:0pt;" coordsize="21600,21600" o:hr="t" o:hrstd="t" o:hralign="center">
+          <v:rect id="_x0000_i1026" o:spt="1" style="height:1.5pt;width:0pt;" coordsize="21600,21600" o:hr="t" o:hrstd="t">
             <v:path/>
             <v:fill focussize="0,0"/>
             <v:stroke/>
@@ -821,7 +797,7 @@
       <w:pPr>
         <w:pStyle w:val="4"/>
         <w:spacing w:before="240" w:after="240" w:line="360" w:lineRule="auto"/>
-        <w:jc w:val="center"/>
+        <w:jc w:val="left"/>
         <w:rPr>
           <w:rFonts w:ascii="Times New Roman" w:hAnsi="Times New Roman" w:eastAsia="黑体" w:cs="Times New Roman"/>
           <w:i w:val="0"/>
@@ -847,7 +823,7 @@
         <w:pStyle w:val="23"/>
         <w:spacing w:before="0" w:after="0" w:line="360" w:lineRule="auto"/>
         <w:ind w:firstLineChars="200"/>
-        <w:jc w:val="both"/>
+        <w:jc w:val="left"/>
         <w:rPr>
           <w:rFonts w:ascii="Times New Roman" w:hAnsi="Times New Roman" w:eastAsia="宋体" w:cs="Times New Roman"/>
           <w:i w:val="0"/>
@@ -896,7 +872,7 @@
         <w:pStyle w:val="23"/>
         <w:spacing w:before="0" w:after="0" w:line="360" w:lineRule="auto"/>
         <w:ind w:firstLineChars="200"/>
-        <w:jc w:val="both"/>
+        <w:jc w:val="left"/>
         <w:rPr>
           <w:rFonts w:ascii="Times New Roman" w:hAnsi="Times New Roman" w:eastAsia="宋体" w:cs="Times New Roman"/>
           <w:i w:val="0"/>
@@ -920,7 +896,7 @@
         <w:pStyle w:val="3"/>
         <w:spacing w:before="0" w:after="0" w:line="360" w:lineRule="auto"/>
         <w:ind w:firstLineChars="200"/>
-        <w:jc w:val="both"/>
+        <w:jc w:val="left"/>
         <w:rPr>
           <w:rFonts w:ascii="Times New Roman" w:hAnsi="Times New Roman" w:eastAsia="宋体" w:cs="Times New Roman"/>
           <w:i w:val="0"/>
@@ -970,7 +946,7 @@
         <w:pStyle w:val="23"/>
         <w:spacing w:before="0" w:after="0" w:line="360" w:lineRule="auto"/>
         <w:ind w:firstLineChars="200"/>
-        <w:jc w:val="both"/>
+        <w:jc w:val="left"/>
         <w:rPr>
           <w:rFonts w:ascii="Times New Roman" w:hAnsi="Times New Roman" w:eastAsia="宋体" w:cs="Times New Roman"/>
           <w:i w:val="0"/>
@@ -993,7 +969,7 @@
       <w:pPr>
         <w:pStyle w:val="3"/>
         <w:spacing w:before="120" w:after="120" w:line="360" w:lineRule="auto"/>
-        <w:jc w:val="center"/>
+        <w:jc w:val="left"/>
         <w:rPr>
           <w:rFonts w:ascii="Times New Roman" w:hAnsi="Times New Roman" w:eastAsia="黑体" w:cs="Times New Roman"/>
           <w:i w:val="0"/>
@@ -1037,9 +1013,9 @@
       </w:tblPr>
       <w:tblGrid>
         <w:gridCol w:w="2002"/>
-        <w:gridCol w:w="1501"/>
-        <w:gridCol w:w="3836"/>
-        <w:gridCol w:w="1835"/>
+        <w:gridCol w:w="1891"/>
+        <w:gridCol w:w="2850"/>
+        <w:gridCol w:w="2431"/>
       </w:tblGrid>
       <w:tr>
         <w:tblPrEx>
@@ -1051,6 +1027,12 @@
             <w:insideH w:val="single" w:color="000000" w:sz="4" w:space="0"/>
             <w:insideV w:val="single" w:color="000000" w:sz="4" w:space="0"/>
           </w:tblBorders>
+          <w:tblCellMar>
+            <w:top w:w="0" w:type="dxa"/>
+            <w:left w:w="108" w:type="dxa"/>
+            <w:bottom w:w="0" w:type="dxa"/>
+            <w:right w:w="108" w:type="dxa"/>
+          </w:tblCellMar>
         </w:tblPrEx>
         <w:trPr>
           <w:tblHeader/>
@@ -1060,7 +1042,7 @@
             <w:pPr>
               <w:pStyle w:val="24"/>
               <w:spacing w:before="0" w:after="0" w:line="312" w:lineRule="auto"/>
-              <w:jc w:val="center"/>
+              <w:jc w:val="left"/>
               <w:rPr>
                 <w:rFonts w:ascii="Times New Roman" w:hAnsi="Times New Roman" w:eastAsia="宋体" w:cs="Times New Roman"/>
                 <w:i w:val="0"/>
@@ -1082,11 +1064,14 @@
           </w:p>
         </w:tc>
         <w:tc>
-          <w:p>
-            <w:pPr>
-              <w:pStyle w:val="24"/>
-              <w:spacing w:before="0" w:after="0" w:line="312" w:lineRule="auto"/>
-              <w:jc w:val="center"/>
+          <w:tcPr>
+            <w:tcW w:w="1030" w:type="pct"/>
+          </w:tcPr>
+          <w:p>
+            <w:pPr>
+              <w:pStyle w:val="24"/>
+              <w:spacing w:before="0" w:after="0" w:line="312" w:lineRule="auto"/>
+              <w:jc w:val="left"/>
               <w:rPr>
                 <w:rFonts w:ascii="Times New Roman" w:hAnsi="Times New Roman" w:eastAsia="宋体" w:cs="Times New Roman"/>
                 <w:i w:val="0"/>
@@ -1108,11 +1093,14 @@
           </w:p>
         </w:tc>
         <w:tc>
-          <w:p>
-            <w:pPr>
-              <w:pStyle w:val="24"/>
-              <w:spacing w:before="0" w:after="0" w:line="312" w:lineRule="auto"/>
-              <w:jc w:val="center"/>
+          <w:tcPr>
+            <w:tcW w:w="1553" w:type="pct"/>
+          </w:tcPr>
+          <w:p>
+            <w:pPr>
+              <w:pStyle w:val="24"/>
+              <w:spacing w:before="0" w:after="0" w:line="312" w:lineRule="auto"/>
+              <w:jc w:val="left"/>
               <w:rPr>
                 <w:rFonts w:ascii="Times New Roman" w:hAnsi="Times New Roman" w:eastAsia="宋体" w:cs="Times New Roman"/>
                 <w:i w:val="0"/>
@@ -1134,11 +1122,14 @@
           </w:p>
         </w:tc>
         <w:tc>
-          <w:p>
-            <w:pPr>
-              <w:pStyle w:val="24"/>
-              <w:spacing w:before="0" w:after="0" w:line="312" w:lineRule="auto"/>
-              <w:jc w:val="center"/>
+          <w:tcPr>
+            <w:tcW w:w="1324" w:type="pct"/>
+          </w:tcPr>
+          <w:p>
+            <w:pPr>
+              <w:pStyle w:val="24"/>
+              <w:spacing w:before="0" w:after="0" w:line="312" w:lineRule="auto"/>
+              <w:jc w:val="left"/>
               <w:rPr>
                 <w:rFonts w:ascii="Times New Roman" w:hAnsi="Times New Roman" w:eastAsia="宋体" w:cs="Times New Roman"/>
                 <w:i w:val="0"/>
@@ -1182,7 +1173,7 @@
             <w:pPr>
               <w:pStyle w:val="24"/>
               <w:spacing w:before="0" w:after="0" w:line="312" w:lineRule="auto"/>
-              <w:jc w:val="center"/>
+              <w:jc w:val="left"/>
               <w:rPr>
                 <w:rFonts w:ascii="Times New Roman" w:hAnsi="Times New Roman" w:eastAsia="宋体" w:cs="Times New Roman"/>
                 <w:i w:val="0"/>
@@ -1203,11 +1194,14 @@
           </w:p>
         </w:tc>
         <w:tc>
-          <w:p>
-            <w:pPr>
-              <w:pStyle w:val="24"/>
-              <w:spacing w:before="0" w:after="0" w:line="312" w:lineRule="auto"/>
-              <w:jc w:val="center"/>
+          <w:tcPr>
+            <w:tcW w:w="1030" w:type="pct"/>
+          </w:tcPr>
+          <w:p>
+            <w:pPr>
+              <w:pStyle w:val="24"/>
+              <w:spacing w:before="0" w:after="0" w:line="312" w:lineRule="auto"/>
+              <w:jc w:val="left"/>
               <w:rPr>
                 <w:rFonts w:ascii="Times New Roman" w:hAnsi="Times New Roman" w:eastAsia="宋体" w:cs="Times New Roman"/>
                 <w:i w:val="0"/>
@@ -1228,11 +1222,14 @@
           </w:p>
         </w:tc>
         <w:tc>
-          <w:p>
-            <w:pPr>
-              <w:pStyle w:val="24"/>
-              <w:spacing w:before="0" w:after="0" w:line="312" w:lineRule="auto"/>
-              <w:jc w:val="center"/>
+          <w:tcPr>
+            <w:tcW w:w="1553" w:type="pct"/>
+          </w:tcPr>
+          <w:p>
+            <w:pPr>
+              <w:pStyle w:val="24"/>
+              <w:spacing w:before="0" w:after="0" w:line="312" w:lineRule="auto"/>
+              <w:jc w:val="left"/>
               <w:rPr>
                 <w:rFonts w:ascii="Times New Roman" w:hAnsi="Times New Roman" w:eastAsia="宋体" w:cs="Times New Roman"/>
                 <w:i w:val="0"/>
@@ -1253,11 +1250,14 @@
           </w:p>
         </w:tc>
         <w:tc>
-          <w:p>
-            <w:pPr>
-              <w:pStyle w:val="24"/>
-              <w:spacing w:before="0" w:after="0" w:line="312" w:lineRule="auto"/>
-              <w:jc w:val="center"/>
+          <w:tcPr>
+            <w:tcW w:w="1324" w:type="pct"/>
+          </w:tcPr>
+          <w:p>
+            <w:pPr>
+              <w:pStyle w:val="24"/>
+              <w:spacing w:before="0" w:after="0" w:line="312" w:lineRule="auto"/>
+              <w:jc w:val="left"/>
               <w:rPr>
                 <w:rFonts w:ascii="Times New Roman" w:hAnsi="Times New Roman" w:eastAsia="宋体" w:cs="Times New Roman"/>
                 <w:i w:val="0"/>
@@ -1300,7 +1300,7 @@
             <w:pPr>
               <w:pStyle w:val="24"/>
               <w:spacing w:before="0" w:after="0" w:line="312" w:lineRule="auto"/>
-              <w:jc w:val="center"/>
+              <w:jc w:val="left"/>
               <w:rPr>
                 <w:rFonts w:ascii="Times New Roman" w:hAnsi="Times New Roman" w:eastAsia="宋体" w:cs="Times New Roman"/>
                 <w:i w:val="0"/>
@@ -1321,11 +1321,14 @@
           </w:p>
         </w:tc>
         <w:tc>
-          <w:p>
-            <w:pPr>
-              <w:pStyle w:val="24"/>
-              <w:spacing w:before="0" w:after="0" w:line="312" w:lineRule="auto"/>
-              <w:jc w:val="center"/>
+          <w:tcPr>
+            <w:tcW w:w="1030" w:type="pct"/>
+          </w:tcPr>
+          <w:p>
+            <w:pPr>
+              <w:pStyle w:val="24"/>
+              <w:spacing w:before="0" w:after="0" w:line="312" w:lineRule="auto"/>
+              <w:jc w:val="left"/>
               <w:rPr>
                 <w:rFonts w:ascii="Times New Roman" w:hAnsi="Times New Roman" w:eastAsia="宋体" w:cs="Times New Roman"/>
                 <w:i w:val="0"/>
@@ -1346,11 +1349,14 @@
           </w:p>
         </w:tc>
         <w:tc>
-          <w:p>
-            <w:pPr>
-              <w:pStyle w:val="24"/>
-              <w:spacing w:before="0" w:after="0" w:line="312" w:lineRule="auto"/>
-              <w:jc w:val="center"/>
+          <w:tcPr>
+            <w:tcW w:w="1553" w:type="pct"/>
+          </w:tcPr>
+          <w:p>
+            <w:pPr>
+              <w:pStyle w:val="24"/>
+              <w:spacing w:before="0" w:after="0" w:line="312" w:lineRule="auto"/>
+              <w:jc w:val="left"/>
               <w:rPr>
                 <w:rFonts w:ascii="Times New Roman" w:hAnsi="Times New Roman" w:eastAsia="宋体" w:cs="Times New Roman"/>
                 <w:i w:val="0"/>
@@ -1371,11 +1377,14 @@
           </w:p>
         </w:tc>
         <w:tc>
-          <w:p>
-            <w:pPr>
-              <w:pStyle w:val="24"/>
-              <w:spacing w:before="0" w:after="0" w:line="312" w:lineRule="auto"/>
-              <w:jc w:val="center"/>
+          <w:tcPr>
+            <w:tcW w:w="1324" w:type="pct"/>
+          </w:tcPr>
+          <w:p>
+            <w:pPr>
+              <w:pStyle w:val="24"/>
+              <w:spacing w:before="0" w:after="0" w:line="312" w:lineRule="auto"/>
+              <w:jc w:val="left"/>
               <w:rPr>
                 <w:rFonts w:ascii="Times New Roman" w:hAnsi="Times New Roman" w:eastAsia="宋体" w:cs="Times New Roman"/>
                 <w:i w:val="0"/>
@@ -1418,7 +1427,7 @@
             <w:pPr>
               <w:pStyle w:val="24"/>
               <w:spacing w:before="0" w:after="0" w:line="312" w:lineRule="auto"/>
-              <w:jc w:val="center"/>
+              <w:jc w:val="left"/>
               <w:rPr>
                 <w:rFonts w:ascii="Times New Roman" w:hAnsi="Times New Roman" w:eastAsia="宋体" w:cs="Times New Roman"/>
                 <w:i w:val="0"/>
@@ -1439,11 +1448,14 @@
           </w:p>
         </w:tc>
         <w:tc>
-          <w:p>
-            <w:pPr>
-              <w:pStyle w:val="24"/>
-              <w:spacing w:before="0" w:after="0" w:line="312" w:lineRule="auto"/>
-              <w:jc w:val="center"/>
+          <w:tcPr>
+            <w:tcW w:w="1030" w:type="pct"/>
+          </w:tcPr>
+          <w:p>
+            <w:pPr>
+              <w:pStyle w:val="24"/>
+              <w:spacing w:before="0" w:after="0" w:line="312" w:lineRule="auto"/>
+              <w:jc w:val="left"/>
               <w:rPr>
                 <w:rFonts w:ascii="Times New Roman" w:hAnsi="Times New Roman" w:eastAsia="宋体" w:cs="Times New Roman"/>
                 <w:i w:val="0"/>
@@ -1464,11 +1476,14 @@
           </w:p>
         </w:tc>
         <w:tc>
-          <w:p>
-            <w:pPr>
-              <w:pStyle w:val="24"/>
-              <w:spacing w:before="0" w:after="0" w:line="312" w:lineRule="auto"/>
-              <w:jc w:val="center"/>
+          <w:tcPr>
+            <w:tcW w:w="1553" w:type="pct"/>
+          </w:tcPr>
+          <w:p>
+            <w:pPr>
+              <w:pStyle w:val="24"/>
+              <w:spacing w:before="0" w:after="0" w:line="312" w:lineRule="auto"/>
+              <w:jc w:val="left"/>
               <w:rPr>
                 <w:rFonts w:ascii="Times New Roman" w:hAnsi="Times New Roman" w:eastAsia="宋体" w:cs="Times New Roman"/>
                 <w:i w:val="0"/>
@@ -1489,11 +1504,14 @@
           </w:p>
         </w:tc>
         <w:tc>
-          <w:p>
-            <w:pPr>
-              <w:pStyle w:val="24"/>
-              <w:spacing w:before="0" w:after="0" w:line="312" w:lineRule="auto"/>
-              <w:jc w:val="center"/>
+          <w:tcPr>
+            <w:tcW w:w="1324" w:type="pct"/>
+          </w:tcPr>
+          <w:p>
+            <w:pPr>
+              <w:pStyle w:val="24"/>
+              <w:spacing w:before="0" w:after="0" w:line="312" w:lineRule="auto"/>
+              <w:jc w:val="left"/>
               <w:rPr>
                 <w:rFonts w:ascii="Times New Roman" w:hAnsi="Times New Roman" w:eastAsia="宋体" w:cs="Times New Roman"/>
                 <w:i w:val="0"/>
@@ -1536,7 +1554,7 @@
             <w:pPr>
               <w:pStyle w:val="24"/>
               <w:spacing w:before="0" w:after="0" w:line="312" w:lineRule="auto"/>
-              <w:jc w:val="center"/>
+              <w:jc w:val="left"/>
               <w:rPr>
                 <w:rFonts w:ascii="Times New Roman" w:hAnsi="Times New Roman" w:eastAsia="宋体" w:cs="Times New Roman"/>
                 <w:i w:val="0"/>
@@ -1557,11 +1575,14 @@
           </w:p>
         </w:tc>
         <w:tc>
-          <w:p>
-            <w:pPr>
-              <w:pStyle w:val="24"/>
-              <w:spacing w:before="0" w:after="0" w:line="312" w:lineRule="auto"/>
-              <w:jc w:val="center"/>
+          <w:tcPr>
+            <w:tcW w:w="1030" w:type="pct"/>
+          </w:tcPr>
+          <w:p>
+            <w:pPr>
+              <w:pStyle w:val="24"/>
+              <w:spacing w:before="0" w:after="0" w:line="312" w:lineRule="auto"/>
+              <w:jc w:val="left"/>
               <w:rPr>
                 <w:rFonts w:ascii="Times New Roman" w:hAnsi="Times New Roman" w:eastAsia="宋体" w:cs="Times New Roman"/>
                 <w:i w:val="0"/>
@@ -1582,11 +1603,14 @@
           </w:p>
         </w:tc>
         <w:tc>
-          <w:p>
-            <w:pPr>
-              <w:pStyle w:val="24"/>
-              <w:spacing w:before="0" w:after="0" w:line="312" w:lineRule="auto"/>
-              <w:jc w:val="center"/>
+          <w:tcPr>
+            <w:tcW w:w="1553" w:type="pct"/>
+          </w:tcPr>
+          <w:p>
+            <w:pPr>
+              <w:pStyle w:val="24"/>
+              <w:spacing w:before="0" w:after="0" w:line="312" w:lineRule="auto"/>
+              <w:jc w:val="left"/>
               <w:rPr>
                 <w:rFonts w:ascii="Times New Roman" w:hAnsi="Times New Roman" w:eastAsia="宋体" w:cs="Times New Roman"/>
                 <w:i w:val="0"/>
@@ -1607,11 +1631,14 @@
           </w:p>
         </w:tc>
         <w:tc>
-          <w:p>
-            <w:pPr>
-              <w:pStyle w:val="24"/>
-              <w:spacing w:before="0" w:after="0" w:line="312" w:lineRule="auto"/>
-              <w:jc w:val="center"/>
+          <w:tcPr>
+            <w:tcW w:w="1324" w:type="pct"/>
+          </w:tcPr>
+          <w:p>
+            <w:pPr>
+              <w:pStyle w:val="24"/>
+              <w:spacing w:before="0" w:after="0" w:line="312" w:lineRule="auto"/>
+              <w:jc w:val="left"/>
               <w:rPr>
                 <w:rFonts w:ascii="Times New Roman" w:hAnsi="Times New Roman" w:eastAsia="宋体" w:cs="Times New Roman"/>
                 <w:i w:val="0"/>
@@ -1654,7 +1681,7 @@
             <w:pPr>
               <w:pStyle w:val="24"/>
               <w:spacing w:before="0" w:after="0" w:line="312" w:lineRule="auto"/>
-              <w:jc w:val="center"/>
+              <w:jc w:val="left"/>
               <w:rPr>
                 <w:rFonts w:ascii="Times New Roman" w:hAnsi="Times New Roman" w:eastAsia="宋体" w:cs="Times New Roman"/>
                 <w:i w:val="0"/>
@@ -1675,11 +1702,14 @@
           </w:p>
         </w:tc>
         <w:tc>
-          <w:p>
-            <w:pPr>
-              <w:pStyle w:val="24"/>
-              <w:spacing w:before="0" w:after="0" w:line="312" w:lineRule="auto"/>
-              <w:jc w:val="center"/>
+          <w:tcPr>
+            <w:tcW w:w="1030" w:type="pct"/>
+          </w:tcPr>
+          <w:p>
+            <w:pPr>
+              <w:pStyle w:val="24"/>
+              <w:spacing w:before="0" w:after="0" w:line="312" w:lineRule="auto"/>
+              <w:jc w:val="left"/>
               <w:rPr>
                 <w:rFonts w:ascii="Times New Roman" w:hAnsi="Times New Roman" w:eastAsia="宋体" w:cs="Times New Roman"/>
                 <w:i w:val="0"/>
@@ -1700,11 +1730,14 @@
           </w:p>
         </w:tc>
         <w:tc>
-          <w:p>
-            <w:pPr>
-              <w:pStyle w:val="24"/>
-              <w:spacing w:before="0" w:after="0" w:line="312" w:lineRule="auto"/>
-              <w:jc w:val="center"/>
+          <w:tcPr>
+            <w:tcW w:w="1553" w:type="pct"/>
+          </w:tcPr>
+          <w:p>
+            <w:pPr>
+              <w:pStyle w:val="24"/>
+              <w:spacing w:before="0" w:after="0" w:line="312" w:lineRule="auto"/>
+              <w:jc w:val="left"/>
               <w:rPr>
                 <w:rFonts w:ascii="Times New Roman" w:hAnsi="Times New Roman" w:eastAsia="宋体" w:cs="Times New Roman"/>
                 <w:i w:val="0"/>
@@ -1725,11 +1758,14 @@
           </w:p>
         </w:tc>
         <w:tc>
-          <w:p>
-            <w:pPr>
-              <w:pStyle w:val="24"/>
-              <w:spacing w:before="0" w:after="0" w:line="312" w:lineRule="auto"/>
-              <w:jc w:val="center"/>
+          <w:tcPr>
+            <w:tcW w:w="1324" w:type="pct"/>
+          </w:tcPr>
+          <w:p>
+            <w:pPr>
+              <w:pStyle w:val="24"/>
+              <w:spacing w:before="0" w:after="0" w:line="312" w:lineRule="auto"/>
+              <w:jc w:val="left"/>
               <w:rPr>
                 <w:rFonts w:ascii="Times New Roman" w:hAnsi="Times New Roman" w:eastAsia="宋体" w:cs="Times New Roman"/>
                 <w:i w:val="0"/>
@@ -1756,7 +1792,7 @@
         <w:pStyle w:val="3"/>
         <w:spacing w:before="0" w:after="0" w:line="360" w:lineRule="auto"/>
         <w:ind w:firstLineChars="200"/>
-        <w:jc w:val="both"/>
+        <w:jc w:val="left"/>
         <w:rPr>
           <w:rFonts w:ascii="Times New Roman" w:hAnsi="Times New Roman" w:eastAsia="宋体" w:cs="Times New Roman"/>
           <w:i w:val="0"/>
@@ -1780,7 +1816,7 @@
         <w:pStyle w:val="3"/>
         <w:spacing w:before="0" w:after="0" w:line="360" w:lineRule="auto"/>
         <w:ind w:firstLineChars="200"/>
-        <w:jc w:val="both"/>
+        <w:jc w:val="left"/>
         <w:rPr>
           <w:rFonts w:ascii="Times New Roman" w:hAnsi="Times New Roman" w:eastAsia="宋体" w:cs="Times New Roman"/>
           <w:i w:val="0"/>
@@ -1830,7 +1866,7 @@
         <w:pStyle w:val="23"/>
         <w:spacing w:before="0" w:after="0" w:line="360" w:lineRule="auto"/>
         <w:ind w:firstLineChars="200"/>
-        <w:jc w:val="both"/>
+        <w:jc w:val="left"/>
         <w:rPr>
           <w:rFonts w:ascii="Times New Roman" w:hAnsi="Times New Roman" w:eastAsia="宋体" w:cs="Times New Roman"/>
           <w:i w:val="0"/>
@@ -1854,7 +1890,7 @@
         <w:pStyle w:val="3"/>
         <w:spacing w:before="0" w:after="0" w:line="360" w:lineRule="auto"/>
         <w:ind w:firstLineChars="200"/>
-        <w:jc w:val="both"/>
+        <w:jc w:val="left"/>
         <w:rPr>
           <w:rFonts w:ascii="Times New Roman" w:hAnsi="Times New Roman" w:eastAsia="宋体" w:cs="Times New Roman"/>
           <w:i w:val="0"/>
@@ -1904,7 +1940,7 @@
         <w:pStyle w:val="23"/>
         <w:spacing w:before="0" w:after="0" w:line="360" w:lineRule="auto"/>
         <w:ind w:firstLineChars="200"/>
-        <w:jc w:val="both"/>
+        <w:jc w:val="left"/>
         <w:rPr>
           <w:rFonts w:ascii="Times New Roman" w:hAnsi="Times New Roman" w:eastAsia="宋体" w:cs="Times New Roman"/>
           <w:i w:val="0"/>
@@ -1928,7 +1964,7 @@
         <w:pStyle w:val="3"/>
         <w:spacing w:before="0" w:after="0" w:line="360" w:lineRule="auto"/>
         <w:ind w:firstLineChars="200"/>
-        <w:jc w:val="both"/>
+        <w:jc w:val="left"/>
         <w:rPr>
           <w:rFonts w:ascii="Times New Roman" w:hAnsi="Times New Roman" w:eastAsia="宋体" w:cs="Times New Roman"/>
           <w:i w:val="0"/>
@@ -1978,7 +2014,7 @@
         <w:pStyle w:val="23"/>
         <w:spacing w:before="0" w:after="0" w:line="360" w:lineRule="auto"/>
         <w:ind w:firstLineChars="200"/>
-        <w:jc w:val="both"/>
+        <w:jc w:val="left"/>
         <w:rPr>
           <w:rFonts w:ascii="Times New Roman" w:hAnsi="Times New Roman" w:eastAsia="宋体" w:cs="Times New Roman"/>
           <w:i w:val="0"/>
@@ -2002,7 +2038,7 @@
         <w:pStyle w:val="3"/>
         <w:spacing w:before="0" w:after="0" w:line="360" w:lineRule="auto"/>
         <w:ind w:firstLineChars="200"/>
-        <w:jc w:val="both"/>
+        <w:jc w:val="left"/>
         <w:rPr>
           <w:rFonts w:ascii="Times New Roman" w:hAnsi="Times New Roman" w:eastAsia="宋体" w:cs="Times New Roman"/>
           <w:i w:val="0"/>
@@ -2041,7 +2077,7 @@
           <w:sz w:val="21"/>
         </w:rPr>
         <w:pict>
-          <v:rect id="_x0000_i1027" o:spt="1" style="height:1.5pt;width:0pt;" coordsize="21600,21600" o:hr="t" o:hrstd="t" o:hralign="center">
+          <v:rect id="_x0000_i1027" o:spt="1" style="height:1.5pt;width:0pt;" coordsize="21600,21600" o:hr="t" o:hrstd="t">
             <v:path/>
             <v:fill focussize="0,0"/>
             <v:stroke/>
@@ -2059,7 +2095,7 @@
       <w:pPr>
         <w:pStyle w:val="4"/>
         <w:spacing w:before="240" w:after="240" w:line="360" w:lineRule="auto"/>
-        <w:jc w:val="center"/>
+        <w:jc w:val="left"/>
         <w:rPr>
           <w:rFonts w:ascii="Times New Roman" w:hAnsi="Times New Roman" w:eastAsia="黑体" w:cs="Times New Roman"/>
           <w:i w:val="0"/>
@@ -2085,7 +2121,7 @@
         <w:pStyle w:val="23"/>
         <w:spacing w:before="0" w:after="0" w:line="360" w:lineRule="auto"/>
         <w:ind w:firstLineChars="200"/>
-        <w:jc w:val="both"/>
+        <w:jc w:val="left"/>
         <w:rPr>
           <w:rFonts w:ascii="Times New Roman" w:hAnsi="Times New Roman" w:eastAsia="宋体" w:cs="Times New Roman"/>
           <w:i w:val="0"/>
@@ -2108,7 +2144,7 @@
       <w:pPr>
         <w:pStyle w:val="3"/>
         <w:spacing w:before="120" w:after="120" w:line="360" w:lineRule="auto"/>
-        <w:jc w:val="center"/>
+        <w:jc w:val="left"/>
         <w:rPr>
           <w:rFonts w:ascii="Times New Roman" w:hAnsi="Times New Roman" w:eastAsia="黑体" w:cs="Times New Roman"/>
           <w:i w:val="0"/>
@@ -2151,10 +2187,10 @@
         </w:tblCellMar>
       </w:tblPr>
       <w:tblGrid>
-        <w:gridCol w:w="1245"/>
-        <w:gridCol w:w="2493"/>
-        <w:gridCol w:w="1245"/>
-        <w:gridCol w:w="4191"/>
+        <w:gridCol w:w="1370"/>
+        <w:gridCol w:w="2509"/>
+        <w:gridCol w:w="1336"/>
+        <w:gridCol w:w="3959"/>
       </w:tblGrid>
       <w:tr>
         <w:tblPrEx>
@@ -2177,11 +2213,14 @@
           <w:tblHeader/>
         </w:trPr>
         <w:tc>
-          <w:p>
-            <w:pPr>
-              <w:pStyle w:val="24"/>
-              <w:spacing w:before="0" w:after="0" w:line="312" w:lineRule="auto"/>
-              <w:jc w:val="center"/>
+          <w:tcPr>
+            <w:tcW w:w="746" w:type="pct"/>
+          </w:tcPr>
+          <w:p>
+            <w:pPr>
+              <w:pStyle w:val="24"/>
+              <w:spacing w:before="0" w:after="0" w:line="312" w:lineRule="auto"/>
+              <w:jc w:val="left"/>
               <w:rPr>
                 <w:rFonts w:ascii="Times New Roman" w:hAnsi="Times New Roman" w:eastAsia="宋体" w:cs="Times New Roman"/>
                 <w:i w:val="0"/>
@@ -2203,11 +2242,14 @@
           </w:p>
         </w:tc>
         <w:tc>
-          <w:p>
-            <w:pPr>
-              <w:pStyle w:val="24"/>
-              <w:spacing w:before="0" w:after="0" w:line="312" w:lineRule="auto"/>
-              <w:jc w:val="center"/>
+          <w:tcPr>
+            <w:tcW w:w="1367" w:type="pct"/>
+          </w:tcPr>
+          <w:p>
+            <w:pPr>
+              <w:pStyle w:val="24"/>
+              <w:spacing w:before="0" w:after="0" w:line="312" w:lineRule="auto"/>
+              <w:jc w:val="left"/>
               <w:rPr>
                 <w:rFonts w:ascii="Times New Roman" w:hAnsi="Times New Roman" w:eastAsia="宋体" w:cs="Times New Roman"/>
                 <w:i w:val="0"/>
@@ -2229,11 +2271,14 @@
           </w:p>
         </w:tc>
         <w:tc>
-          <w:p>
-            <w:pPr>
-              <w:pStyle w:val="24"/>
-              <w:spacing w:before="0" w:after="0" w:line="312" w:lineRule="auto"/>
-              <w:jc w:val="center"/>
+          <w:tcPr>
+            <w:tcW w:w="728" w:type="pct"/>
+          </w:tcPr>
+          <w:p>
+            <w:pPr>
+              <w:pStyle w:val="24"/>
+              <w:spacing w:before="0" w:after="0" w:line="312" w:lineRule="auto"/>
+              <w:jc w:val="left"/>
               <w:rPr>
                 <w:rFonts w:ascii="Times New Roman" w:hAnsi="Times New Roman" w:eastAsia="宋体" w:cs="Times New Roman"/>
                 <w:i w:val="0"/>
@@ -2255,11 +2300,14 @@
           </w:p>
         </w:tc>
         <w:tc>
-          <w:p>
-            <w:pPr>
-              <w:pStyle w:val="24"/>
-              <w:spacing w:before="0" w:after="0" w:line="312" w:lineRule="auto"/>
-              <w:jc w:val="center"/>
+          <w:tcPr>
+            <w:tcW w:w="2157" w:type="pct"/>
+          </w:tcPr>
+          <w:p>
+            <w:pPr>
+              <w:pStyle w:val="24"/>
+              <w:spacing w:before="0" w:after="0" w:line="312" w:lineRule="auto"/>
+              <w:jc w:val="left"/>
               <w:rPr>
                 <w:rFonts w:ascii="Times New Roman" w:hAnsi="Times New Roman" w:eastAsia="宋体" w:cs="Times New Roman"/>
                 <w:i w:val="0"/>
@@ -2299,11 +2347,14 @@
           </w:tblCellMar>
         </w:tblPrEx>
         <w:tc>
-          <w:p>
-            <w:pPr>
-              <w:pStyle w:val="24"/>
-              <w:spacing w:before="0" w:after="0" w:line="312" w:lineRule="auto"/>
-              <w:jc w:val="center"/>
+          <w:tcPr>
+            <w:tcW w:w="746" w:type="pct"/>
+          </w:tcPr>
+          <w:p>
+            <w:pPr>
+              <w:pStyle w:val="24"/>
+              <w:spacing w:before="0" w:after="0" w:line="312" w:lineRule="auto"/>
+              <w:jc w:val="left"/>
               <w:rPr>
                 <w:rFonts w:ascii="Times New Roman" w:hAnsi="Times New Roman" w:eastAsia="宋体" w:cs="Times New Roman"/>
                 <w:i w:val="0"/>
@@ -2324,11 +2375,14 @@
           </w:p>
         </w:tc>
         <w:tc>
-          <w:p>
-            <w:pPr>
-              <w:pStyle w:val="24"/>
-              <w:spacing w:before="0" w:after="0" w:line="312" w:lineRule="auto"/>
-              <w:jc w:val="center"/>
+          <w:tcPr>
+            <w:tcW w:w="1367" w:type="pct"/>
+          </w:tcPr>
+          <w:p>
+            <w:pPr>
+              <w:pStyle w:val="24"/>
+              <w:spacing w:before="0" w:after="0" w:line="312" w:lineRule="auto"/>
+              <w:jc w:val="left"/>
               <w:rPr>
                 <w:rFonts w:ascii="Times New Roman" w:hAnsi="Times New Roman" w:eastAsia="宋体" w:cs="Times New Roman"/>
                 <w:i w:val="0"/>
@@ -2349,11 +2403,14 @@
           </w:p>
         </w:tc>
         <w:tc>
-          <w:p>
-            <w:pPr>
-              <w:pStyle w:val="24"/>
-              <w:spacing w:before="0" w:after="0" w:line="312" w:lineRule="auto"/>
-              <w:jc w:val="center"/>
+          <w:tcPr>
+            <w:tcW w:w="728" w:type="pct"/>
+          </w:tcPr>
+          <w:p>
+            <w:pPr>
+              <w:pStyle w:val="24"/>
+              <w:spacing w:before="0" w:after="0" w:line="312" w:lineRule="auto"/>
+              <w:jc w:val="left"/>
               <w:rPr>
                 <w:rFonts w:ascii="Times New Roman" w:hAnsi="Times New Roman" w:eastAsia="宋体" w:cs="Times New Roman"/>
                 <w:i w:val="0"/>
@@ -2374,11 +2431,14 @@
           </w:p>
         </w:tc>
         <w:tc>
-          <w:p>
-            <w:pPr>
-              <w:pStyle w:val="24"/>
-              <w:spacing w:before="0" w:after="0" w:line="312" w:lineRule="auto"/>
-              <w:jc w:val="center"/>
+          <w:tcPr>
+            <w:tcW w:w="2157" w:type="pct"/>
+          </w:tcPr>
+          <w:p>
+            <w:pPr>
+              <w:pStyle w:val="24"/>
+              <w:spacing w:before="0" w:after="0" w:line="312" w:lineRule="auto"/>
+              <w:jc w:val="left"/>
               <w:rPr>
                 <w:rFonts w:ascii="Times New Roman" w:hAnsi="Times New Roman" w:eastAsia="宋体" w:cs="Times New Roman"/>
                 <w:i w:val="0"/>
@@ -2417,11 +2477,14 @@
           </w:tblCellMar>
         </w:tblPrEx>
         <w:tc>
-          <w:p>
-            <w:pPr>
-              <w:pStyle w:val="24"/>
-              <w:spacing w:before="0" w:after="0" w:line="312" w:lineRule="auto"/>
-              <w:jc w:val="center"/>
+          <w:tcPr>
+            <w:tcW w:w="746" w:type="pct"/>
+          </w:tcPr>
+          <w:p>
+            <w:pPr>
+              <w:pStyle w:val="24"/>
+              <w:spacing w:before="0" w:after="0" w:line="312" w:lineRule="auto"/>
+              <w:jc w:val="left"/>
               <w:rPr>
                 <w:rFonts w:ascii="Times New Roman" w:hAnsi="Times New Roman" w:eastAsia="宋体" w:cs="Times New Roman"/>
                 <w:i w:val="0"/>
@@ -2442,11 +2505,14 @@
           </w:p>
         </w:tc>
         <w:tc>
-          <w:p>
-            <w:pPr>
-              <w:pStyle w:val="24"/>
-              <w:spacing w:before="0" w:after="0" w:line="312" w:lineRule="auto"/>
-              <w:jc w:val="center"/>
+          <w:tcPr>
+            <w:tcW w:w="1367" w:type="pct"/>
+          </w:tcPr>
+          <w:p>
+            <w:pPr>
+              <w:pStyle w:val="24"/>
+              <w:spacing w:before="0" w:after="0" w:line="312" w:lineRule="auto"/>
+              <w:jc w:val="left"/>
               <w:rPr>
                 <w:rFonts w:ascii="Times New Roman" w:hAnsi="Times New Roman" w:eastAsia="宋体" w:cs="Times New Roman"/>
                 <w:i w:val="0"/>
@@ -2467,11 +2533,14 @@
           </w:p>
         </w:tc>
         <w:tc>
-          <w:p>
-            <w:pPr>
-              <w:pStyle w:val="24"/>
-              <w:spacing w:before="0" w:after="0" w:line="312" w:lineRule="auto"/>
-              <w:jc w:val="center"/>
+          <w:tcPr>
+            <w:tcW w:w="728" w:type="pct"/>
+          </w:tcPr>
+          <w:p>
+            <w:pPr>
+              <w:pStyle w:val="24"/>
+              <w:spacing w:before="0" w:after="0" w:line="312" w:lineRule="auto"/>
+              <w:jc w:val="left"/>
               <w:rPr>
                 <w:rFonts w:ascii="Times New Roman" w:hAnsi="Times New Roman" w:eastAsia="宋体" w:cs="Times New Roman"/>
                 <w:i w:val="0"/>
@@ -2492,11 +2561,14 @@
           </w:p>
         </w:tc>
         <w:tc>
-          <w:p>
-            <w:pPr>
-              <w:pStyle w:val="24"/>
-              <w:spacing w:before="0" w:after="0" w:line="312" w:lineRule="auto"/>
-              <w:jc w:val="center"/>
+          <w:tcPr>
+            <w:tcW w:w="2157" w:type="pct"/>
+          </w:tcPr>
+          <w:p>
+            <w:pPr>
+              <w:pStyle w:val="24"/>
+              <w:spacing w:before="0" w:after="0" w:line="312" w:lineRule="auto"/>
+              <w:jc w:val="left"/>
               <w:rPr>
                 <w:rFonts w:ascii="Times New Roman" w:hAnsi="Times New Roman" w:eastAsia="宋体" w:cs="Times New Roman"/>
                 <w:i w:val="0"/>
@@ -2535,11 +2607,14 @@
           </w:tblCellMar>
         </w:tblPrEx>
         <w:tc>
-          <w:p>
-            <w:pPr>
-              <w:pStyle w:val="24"/>
-              <w:spacing w:before="0" w:after="0" w:line="312" w:lineRule="auto"/>
-              <w:jc w:val="center"/>
+          <w:tcPr>
+            <w:tcW w:w="746" w:type="pct"/>
+          </w:tcPr>
+          <w:p>
+            <w:pPr>
+              <w:pStyle w:val="24"/>
+              <w:spacing w:before="0" w:after="0" w:line="312" w:lineRule="auto"/>
+              <w:jc w:val="left"/>
               <w:rPr>
                 <w:rFonts w:ascii="Times New Roman" w:hAnsi="Times New Roman" w:eastAsia="宋体" w:cs="Times New Roman"/>
                 <w:i w:val="0"/>
@@ -2560,11 +2635,14 @@
           </w:p>
         </w:tc>
         <w:tc>
-          <w:p>
-            <w:pPr>
-              <w:pStyle w:val="24"/>
-              <w:spacing w:before="0" w:after="0" w:line="312" w:lineRule="auto"/>
-              <w:jc w:val="center"/>
+          <w:tcPr>
+            <w:tcW w:w="1367" w:type="pct"/>
+          </w:tcPr>
+          <w:p>
+            <w:pPr>
+              <w:pStyle w:val="24"/>
+              <w:spacing w:before="0" w:after="0" w:line="312" w:lineRule="auto"/>
+              <w:jc w:val="left"/>
               <w:rPr>
                 <w:rFonts w:ascii="Times New Roman" w:hAnsi="Times New Roman" w:eastAsia="宋体" w:cs="Times New Roman"/>
                 <w:i w:val="0"/>
@@ -2585,11 +2663,14 @@
           </w:p>
         </w:tc>
         <w:tc>
-          <w:p>
-            <w:pPr>
-              <w:pStyle w:val="24"/>
-              <w:spacing w:before="0" w:after="0" w:line="312" w:lineRule="auto"/>
-              <w:jc w:val="center"/>
+          <w:tcPr>
+            <w:tcW w:w="728" w:type="pct"/>
+          </w:tcPr>
+          <w:p>
+            <w:pPr>
+              <w:pStyle w:val="24"/>
+              <w:spacing w:before="0" w:after="0" w:line="312" w:lineRule="auto"/>
+              <w:jc w:val="left"/>
               <w:rPr>
                 <w:rFonts w:ascii="Times New Roman" w:hAnsi="Times New Roman" w:eastAsia="宋体" w:cs="Times New Roman"/>
                 <w:i w:val="0"/>
@@ -2610,11 +2691,14 @@
           </w:p>
         </w:tc>
         <w:tc>
-          <w:p>
-            <w:pPr>
-              <w:pStyle w:val="24"/>
-              <w:spacing w:before="0" w:after="0" w:line="312" w:lineRule="auto"/>
-              <w:jc w:val="center"/>
+          <w:tcPr>
+            <w:tcW w:w="2157" w:type="pct"/>
+          </w:tcPr>
+          <w:p>
+            <w:pPr>
+              <w:pStyle w:val="24"/>
+              <w:spacing w:before="0" w:after="0" w:line="312" w:lineRule="auto"/>
+              <w:jc w:val="left"/>
               <w:rPr>
                 <w:rFonts w:ascii="Times New Roman" w:hAnsi="Times New Roman" w:eastAsia="宋体" w:cs="Times New Roman"/>
                 <w:i w:val="0"/>
@@ -2653,11 +2737,14 @@
           </w:tblCellMar>
         </w:tblPrEx>
         <w:tc>
-          <w:p>
-            <w:pPr>
-              <w:pStyle w:val="24"/>
-              <w:spacing w:before="0" w:after="0" w:line="312" w:lineRule="auto"/>
-              <w:jc w:val="center"/>
+          <w:tcPr>
+            <w:tcW w:w="746" w:type="pct"/>
+          </w:tcPr>
+          <w:p>
+            <w:pPr>
+              <w:pStyle w:val="24"/>
+              <w:spacing w:before="0" w:after="0" w:line="312" w:lineRule="auto"/>
+              <w:jc w:val="left"/>
               <w:rPr>
                 <w:rFonts w:ascii="Times New Roman" w:hAnsi="Times New Roman" w:eastAsia="宋体" w:cs="Times New Roman"/>
                 <w:i w:val="0"/>
@@ -2678,11 +2765,14 @@
           </w:p>
         </w:tc>
         <w:tc>
-          <w:p>
-            <w:pPr>
-              <w:pStyle w:val="24"/>
-              <w:spacing w:before="0" w:after="0" w:line="312" w:lineRule="auto"/>
-              <w:jc w:val="center"/>
+          <w:tcPr>
+            <w:tcW w:w="1367" w:type="pct"/>
+          </w:tcPr>
+          <w:p>
+            <w:pPr>
+              <w:pStyle w:val="24"/>
+              <w:spacing w:before="0" w:after="0" w:line="312" w:lineRule="auto"/>
+              <w:jc w:val="left"/>
               <w:rPr>
                 <w:rFonts w:ascii="Times New Roman" w:hAnsi="Times New Roman" w:eastAsia="宋体" w:cs="Times New Roman"/>
                 <w:i w:val="0"/>
@@ -2703,11 +2793,14 @@
           </w:p>
         </w:tc>
         <w:tc>
-          <w:p>
-            <w:pPr>
-              <w:pStyle w:val="24"/>
-              <w:spacing w:before="0" w:after="0" w:line="312" w:lineRule="auto"/>
-              <w:jc w:val="center"/>
+          <w:tcPr>
+            <w:tcW w:w="728" w:type="pct"/>
+          </w:tcPr>
+          <w:p>
+            <w:pPr>
+              <w:pStyle w:val="24"/>
+              <w:spacing w:before="0" w:after="0" w:line="312" w:lineRule="auto"/>
+              <w:jc w:val="left"/>
               <w:rPr>
                 <w:rFonts w:ascii="Times New Roman" w:hAnsi="Times New Roman" w:eastAsia="宋体" w:cs="Times New Roman"/>
                 <w:i w:val="0"/>
@@ -2728,11 +2821,14 @@
           </w:p>
         </w:tc>
         <w:tc>
-          <w:p>
-            <w:pPr>
-              <w:pStyle w:val="24"/>
-              <w:spacing w:before="0" w:after="0" w:line="312" w:lineRule="auto"/>
-              <w:jc w:val="center"/>
+          <w:tcPr>
+            <w:tcW w:w="2157" w:type="pct"/>
+          </w:tcPr>
+          <w:p>
+            <w:pPr>
+              <w:pStyle w:val="24"/>
+              <w:spacing w:before="0" w:after="0" w:line="312" w:lineRule="auto"/>
+              <w:jc w:val="left"/>
               <w:rPr>
                 <w:rFonts w:ascii="Times New Roman" w:hAnsi="Times New Roman" w:eastAsia="宋体" w:cs="Times New Roman"/>
                 <w:i w:val="0"/>
@@ -2784,7 +2880,7 @@
         <w:pStyle w:val="23"/>
         <w:spacing w:before="0" w:after="0" w:line="360" w:lineRule="auto"/>
         <w:ind w:firstLineChars="200"/>
-        <w:jc w:val="both"/>
+        <w:jc w:val="left"/>
         <w:rPr>
           <w:rFonts w:ascii="Times New Roman" w:hAnsi="Times New Roman" w:eastAsia="宋体" w:cs="Times New Roman"/>
           <w:i w:val="0"/>
@@ -2808,7 +2904,7 @@
         <w:pStyle w:val="3"/>
         <w:spacing w:before="0" w:after="0" w:line="360" w:lineRule="auto"/>
         <w:ind w:firstLineChars="200"/>
-        <w:jc w:val="both"/>
+        <w:jc w:val="left"/>
         <w:rPr>
           <w:rFonts w:ascii="Times New Roman" w:hAnsi="Times New Roman" w:eastAsia="宋体" w:cs="Times New Roman"/>
           <w:i w:val="0"/>
@@ -2832,7 +2928,7 @@
         <w:pStyle w:val="3"/>
         <w:spacing w:before="0" w:after="0" w:line="360" w:lineRule="auto"/>
         <w:ind w:firstLineChars="200"/>
-        <w:jc w:val="both"/>
+        <w:jc w:val="left"/>
         <w:rPr>
           <w:rFonts w:ascii="Times New Roman" w:hAnsi="Times New Roman" w:eastAsia="宋体" w:cs="Times New Roman"/>
           <w:i w:val="0"/>
@@ -2882,7 +2978,7 @@
         <w:pStyle w:val="23"/>
         <w:spacing w:before="0" w:after="0" w:line="360" w:lineRule="auto"/>
         <w:ind w:firstLineChars="200"/>
-        <w:jc w:val="both"/>
+        <w:jc w:val="left"/>
         <w:rPr>
           <w:rFonts w:ascii="Times New Roman" w:hAnsi="Times New Roman" w:eastAsia="宋体" w:cs="Times New Roman"/>
           <w:i w:val="0"/>
@@ -2906,7 +3002,7 @@
         <w:pStyle w:val="3"/>
         <w:spacing w:before="0" w:after="0" w:line="360" w:lineRule="auto"/>
         <w:ind w:firstLineChars="200"/>
-        <w:jc w:val="both"/>
+        <w:jc w:val="left"/>
         <w:rPr>
           <w:rFonts w:ascii="Times New Roman" w:hAnsi="Times New Roman" w:eastAsia="宋体" w:cs="Times New Roman"/>
           <w:i w:val="0"/>
@@ -2930,7 +3026,7 @@
         <w:pStyle w:val="3"/>
         <w:spacing w:before="0" w:after="0" w:line="360" w:lineRule="auto"/>
         <w:ind w:firstLineChars="200"/>
-        <w:jc w:val="both"/>
+        <w:jc w:val="left"/>
         <w:rPr>
           <w:rFonts w:ascii="Times New Roman" w:hAnsi="Times New Roman" w:eastAsia="宋体" w:cs="Times New Roman"/>
           <w:i w:val="0"/>
@@ -2980,7 +3076,7 @@
         <w:pStyle w:val="23"/>
         <w:spacing w:before="0" w:after="0" w:line="360" w:lineRule="auto"/>
         <w:ind w:firstLineChars="200"/>
-        <w:jc w:val="both"/>
+        <w:jc w:val="left"/>
         <w:rPr>
           <w:rFonts w:ascii="Times New Roman" w:hAnsi="Times New Roman" w:eastAsia="宋体" w:cs="Times New Roman"/>
           <w:i w:val="0"/>
@@ -3004,7 +3100,7 @@
         <w:pStyle w:val="3"/>
         <w:spacing w:before="0" w:after="0" w:line="360" w:lineRule="auto"/>
         <w:ind w:firstLineChars="200"/>
-        <w:jc w:val="both"/>
+        <w:jc w:val="left"/>
         <w:rPr>
           <w:rFonts w:ascii="Times New Roman" w:hAnsi="Times New Roman" w:eastAsia="宋体" w:cs="Times New Roman"/>
           <w:i w:val="0"/>
@@ -3028,7 +3124,7 @@
         <w:pStyle w:val="3"/>
         <w:spacing w:before="0" w:after="0" w:line="360" w:lineRule="auto"/>
         <w:ind w:firstLineChars="200"/>
-        <w:jc w:val="both"/>
+        <w:jc w:val="left"/>
         <w:rPr>
           <w:rFonts w:ascii="Times New Roman" w:hAnsi="Times New Roman" w:eastAsia="宋体" w:cs="Times New Roman"/>
           <w:i w:val="0"/>
@@ -3078,7 +3174,7 @@
         <w:pStyle w:val="23"/>
         <w:spacing w:before="0" w:after="0" w:line="360" w:lineRule="auto"/>
         <w:ind w:firstLineChars="200"/>
-        <w:jc w:val="both"/>
+        <w:jc w:val="left"/>
         <w:rPr>
           <w:rFonts w:ascii="Times New Roman" w:hAnsi="Times New Roman" w:eastAsia="宋体" w:cs="Times New Roman"/>
           <w:i w:val="0"/>
@@ -3102,7 +3198,7 @@
         <w:pStyle w:val="3"/>
         <w:spacing w:before="0" w:after="0" w:line="360" w:lineRule="auto"/>
         <w:ind w:firstLineChars="200"/>
-        <w:jc w:val="both"/>
+        <w:jc w:val="left"/>
         <w:rPr>
           <w:rFonts w:ascii="Times New Roman" w:hAnsi="Times New Roman" w:eastAsia="宋体" w:cs="Times New Roman"/>
           <w:i w:val="0"/>
@@ -3126,7 +3222,7 @@
         <w:pStyle w:val="3"/>
         <w:spacing w:before="0" w:after="0" w:line="360" w:lineRule="auto"/>
         <w:ind w:firstLineChars="200"/>
-        <w:jc w:val="both"/>
+        <w:jc w:val="left"/>
         <w:rPr>
           <w:rFonts w:ascii="Times New Roman" w:hAnsi="Times New Roman" w:eastAsia="宋体" w:cs="Times New Roman"/>
           <w:i w:val="0"/>
@@ -3150,7 +3246,7 @@
         <w:pStyle w:val="3"/>
         <w:spacing w:before="0" w:after="0" w:line="360" w:lineRule="auto"/>
         <w:ind w:firstLineChars="200"/>
-        <w:jc w:val="both"/>
+        <w:jc w:val="left"/>
         <w:rPr>
           <w:rFonts w:ascii="Times New Roman" w:hAnsi="Times New Roman" w:eastAsia="宋体" w:cs="Times New Roman"/>
           <w:i w:val="0"/>
@@ -3200,7 +3296,7 @@
         <w:pStyle w:val="23"/>
         <w:spacing w:before="0" w:after="0" w:line="360" w:lineRule="auto"/>
         <w:ind w:firstLineChars="200"/>
-        <w:jc w:val="both"/>
+        <w:jc w:val="left"/>
         <w:rPr>
           <w:rFonts w:ascii="Times New Roman" w:hAnsi="Times New Roman" w:eastAsia="宋体" w:cs="Times New Roman"/>
           <w:i w:val="0"/>
@@ -3224,7 +3320,7 @@
         <w:pStyle w:val="3"/>
         <w:spacing w:before="0" w:after="0" w:line="360" w:lineRule="auto"/>
         <w:ind w:firstLineChars="200"/>
-        <w:jc w:val="both"/>
+        <w:jc w:val="left"/>
         <w:rPr>
           <w:rFonts w:ascii="Times New Roman" w:hAnsi="Times New Roman" w:eastAsia="宋体" w:cs="Times New Roman"/>
           <w:i w:val="0"/>
@@ -3263,7 +3359,7 @@
           <w:sz w:val="21"/>
         </w:rPr>
         <w:pict>
-          <v:rect id="_x0000_i1028" o:spt="1" style="height:1.5pt;width:0pt;" coordsize="21600,21600" o:hr="t" o:hrstd="t" o:hralign="center">
+          <v:rect id="_x0000_i1028" o:spt="1" style="height:1.5pt;width:0pt;" coordsize="21600,21600" o:hr="t" o:hrstd="t">
             <v:path/>
             <v:fill focussize="0,0"/>
             <v:stroke/>
@@ -3281,7 +3377,7 @@
       <w:pPr>
         <w:pStyle w:val="4"/>
         <w:spacing w:before="240" w:after="240" w:line="360" w:lineRule="auto"/>
-        <w:jc w:val="center"/>
+        <w:jc w:val="left"/>
         <w:rPr>
           <w:rFonts w:ascii="Times New Roman" w:hAnsi="Times New Roman" w:eastAsia="黑体" w:cs="Times New Roman"/>
           <w:i w:val="0"/>
@@ -3307,7 +3403,7 @@
         <w:pStyle w:val="23"/>
         <w:spacing w:before="0" w:after="0" w:line="360" w:lineRule="auto"/>
         <w:ind w:firstLineChars="200"/>
-        <w:jc w:val="both"/>
+        <w:jc w:val="left"/>
         <w:rPr>
           <w:rFonts w:ascii="Times New Roman" w:hAnsi="Times New Roman" w:eastAsia="宋体" w:cs="Times New Roman"/>
           <w:i w:val="0"/>
@@ -3331,7 +3427,7 @@
         <w:pStyle w:val="3"/>
         <w:spacing w:before="0" w:after="0" w:line="360" w:lineRule="auto"/>
         <w:ind w:firstLineChars="200"/>
-        <w:jc w:val="both"/>
+        <w:jc w:val="left"/>
         <w:rPr>
           <w:rFonts w:ascii="Times New Roman" w:hAnsi="Times New Roman" w:eastAsia="宋体" w:cs="Times New Roman"/>
           <w:i w:val="0"/>
@@ -3380,7 +3476,7 @@
         <w:pStyle w:val="23"/>
         <w:spacing w:before="0" w:after="0" w:line="360" w:lineRule="auto"/>
         <w:ind w:firstLineChars="200"/>
-        <w:jc w:val="both"/>
+        <w:jc w:val="left"/>
         <w:rPr>
           <w:rFonts w:ascii="Times New Roman" w:hAnsi="Times New Roman" w:eastAsia="宋体" w:cs="Times New Roman"/>
           <w:i w:val="0"/>
@@ -3429,7 +3525,7 @@
         <w:pStyle w:val="23"/>
         <w:spacing w:before="0" w:after="0" w:line="360" w:lineRule="auto"/>
         <w:ind w:firstLineChars="200"/>
-        <w:jc w:val="both"/>
+        <w:jc w:val="left"/>
         <w:rPr>
           <w:rFonts w:ascii="Times New Roman" w:hAnsi="Times New Roman" w:eastAsia="宋体" w:cs="Times New Roman"/>
           <w:i w:val="0"/>
@@ -3453,35 +3549,23 @@
         <w:pStyle w:val="3"/>
         <w:spacing w:before="0" w:after="0" w:line="360" w:lineRule="auto"/>
         <w:ind w:firstLineChars="200"/>
-        <w:jc w:val="both"/>
-        <w:rPr>
-          <w:rFonts w:ascii="Times New Roman" w:hAnsi="Times New Roman" w:eastAsia="宋体" w:cs="Times New Roman"/>
-          <w:i w:val="0"/>
-          <w:iCs w:val="0"/>
-          <w:color w:val="auto"/>
-        </w:rPr>
-      </w:pPr>
-      <w:r>
-        <w:rPr>
-          <w:rFonts w:ascii="Times New Roman" w:hAnsi="Times New Roman" w:eastAsia="宋体" w:cs="Times New Roman"/>
-          <w:i w:val="0"/>
-          <w:iCs w:val="0"/>
-          <w:color w:val="auto"/>
-          <w:sz w:val="21"/>
-        </w:rPr>
-        <w:t>区别于通用Agent的扁平工作记忆，项目态势书承载了地产项目特有的层级化、节点化态势结构。Agent记忆机制的</w:t>
-      </w:r>
-      <w:bookmarkStart w:id="43" w:name="_GoBack"/>
-      <w:bookmarkEnd w:id="43"/>
-      <w:r>
-        <w:rPr>
-          <w:rFonts w:ascii="Times New Roman" w:hAnsi="Times New Roman" w:eastAsia="宋体" w:cs="Times New Roman"/>
-          <w:i w:val="0"/>
-          <w:iCs w:val="0"/>
-          <w:color w:val="auto"/>
-          <w:sz w:val="21"/>
-        </w:rPr>
-        <w:t>研究表明，记忆的组织形式对Agent能力具有重要影响[3]。本文的项目态势书针对地产项目的管理特征进行了特化设计，使得智能体能够以符合行业习惯的方式理解和呈现项目状态。</w:t>
+        <w:jc w:val="left"/>
+        <w:rPr>
+          <w:rFonts w:ascii="Times New Roman" w:hAnsi="Times New Roman" w:eastAsia="宋体" w:cs="Times New Roman"/>
+          <w:i w:val="0"/>
+          <w:iCs w:val="0"/>
+          <w:color w:val="auto"/>
+        </w:rPr>
+      </w:pPr>
+      <w:r>
+        <w:rPr>
+          <w:rFonts w:ascii="Times New Roman" w:hAnsi="Times New Roman" w:eastAsia="宋体" w:cs="Times New Roman"/>
+          <w:i w:val="0"/>
+          <w:iCs w:val="0"/>
+          <w:color w:val="auto"/>
+          <w:sz w:val="21"/>
+        </w:rPr>
+        <w:t>区别于通用Agent的扁平工作记忆，项目态势书承载了地产项目特有的层级化、节点化态势结构。Agent记忆机制的研究表明，记忆的组织形式对Agent能力具有重要影响[3]。本文的项目态势书针对地产项目的管理特征进行了特化设计，使得智能体能够以符合行业习惯的方式理解和呈现项目状态。</w:t>
       </w:r>
     </w:p>
     <w:bookmarkEnd w:id="24"/>
@@ -3515,7 +3599,7 @@
         <w:pStyle w:val="23"/>
         <w:spacing w:before="0" w:after="0" w:line="360" w:lineRule="auto"/>
         <w:ind w:firstLineChars="200"/>
-        <w:jc w:val="both"/>
+        <w:jc w:val="left"/>
         <w:rPr>
           <w:rFonts w:ascii="Times New Roman" w:hAnsi="Times New Roman" w:eastAsia="宋体" w:cs="Times New Roman"/>
           <w:i w:val="0"/>
@@ -3539,7 +3623,7 @@
         <w:pStyle w:val="3"/>
         <w:spacing w:before="0" w:after="0" w:line="360" w:lineRule="auto"/>
         <w:ind w:firstLineChars="200"/>
-        <w:jc w:val="both"/>
+        <w:jc w:val="left"/>
         <w:rPr>
           <w:rFonts w:ascii="Times New Roman" w:hAnsi="Times New Roman" w:eastAsia="宋体" w:cs="Times New Roman"/>
           <w:i w:val="0"/>
@@ -3589,7 +3673,7 @@
         <w:pStyle w:val="23"/>
         <w:spacing w:before="0" w:after="0" w:line="360" w:lineRule="auto"/>
         <w:ind w:firstLineChars="200"/>
-        <w:jc w:val="both"/>
+        <w:jc w:val="left"/>
         <w:rPr>
           <w:rFonts w:ascii="Times New Roman" w:hAnsi="Times New Roman" w:eastAsia="宋体" w:cs="Times New Roman"/>
           <w:i w:val="0"/>
@@ -3613,7 +3697,7 @@
         <w:pStyle w:val="3"/>
         <w:spacing w:before="0" w:after="0" w:line="360" w:lineRule="auto"/>
         <w:ind w:firstLineChars="200"/>
-        <w:jc w:val="both"/>
+        <w:jc w:val="left"/>
         <w:rPr>
           <w:rFonts w:ascii="Times New Roman" w:hAnsi="Times New Roman" w:eastAsia="宋体" w:cs="Times New Roman"/>
           <w:i w:val="0"/>
@@ -3663,7 +3747,7 @@
         <w:pStyle w:val="23"/>
         <w:spacing w:before="0" w:after="0" w:line="360" w:lineRule="auto"/>
         <w:ind w:firstLineChars="200"/>
-        <w:jc w:val="both"/>
+        <w:jc w:val="left"/>
         <w:rPr>
           <w:rFonts w:ascii="Times New Roman" w:hAnsi="Times New Roman" w:eastAsia="宋体" w:cs="Times New Roman"/>
           <w:i w:val="0"/>
@@ -3687,7 +3771,7 @@
         <w:pStyle w:val="3"/>
         <w:spacing w:before="0" w:after="0" w:line="360" w:lineRule="auto"/>
         <w:ind w:firstLineChars="200"/>
-        <w:jc w:val="both"/>
+        <w:jc w:val="left"/>
         <w:rPr>
           <w:rFonts w:ascii="Times New Roman" w:hAnsi="Times New Roman" w:eastAsia="宋体" w:cs="Times New Roman"/>
           <w:i w:val="0"/>
@@ -3711,7 +3795,7 @@
         <w:pStyle w:val="3"/>
         <w:spacing w:before="0" w:after="0" w:line="360" w:lineRule="auto"/>
         <w:ind w:firstLineChars="200"/>
-        <w:jc w:val="both"/>
+        <w:jc w:val="left"/>
         <w:rPr>
           <w:rFonts w:ascii="Times New Roman" w:hAnsi="Times New Roman" w:eastAsia="宋体" w:cs="Times New Roman"/>
           <w:i w:val="0"/>
@@ -3762,7 +3846,7 @@
         <w:pStyle w:val="23"/>
         <w:spacing w:before="0" w:after="0" w:line="360" w:lineRule="auto"/>
         <w:ind w:firstLineChars="200"/>
-        <w:jc w:val="both"/>
+        <w:jc w:val="left"/>
         <w:rPr>
           <w:rFonts w:ascii="Times New Roman" w:hAnsi="Times New Roman" w:eastAsia="宋体" w:cs="Times New Roman"/>
           <w:i w:val="0"/>
@@ -3811,7 +3895,7 @@
         <w:pStyle w:val="23"/>
         <w:spacing w:before="0" w:after="0" w:line="360" w:lineRule="auto"/>
         <w:ind w:firstLineChars="200"/>
-        <w:jc w:val="both"/>
+        <w:jc w:val="left"/>
         <w:rPr>
           <w:rFonts w:ascii="Times New Roman" w:hAnsi="Times New Roman" w:eastAsia="宋体" w:cs="Times New Roman"/>
           <w:i w:val="0"/>
@@ -3835,7 +3919,7 @@
         <w:pStyle w:val="3"/>
         <w:spacing w:before="0" w:after="0" w:line="360" w:lineRule="auto"/>
         <w:ind w:firstLineChars="200"/>
-        <w:jc w:val="both"/>
+        <w:jc w:val="left"/>
         <w:rPr>
           <w:rFonts w:ascii="Times New Roman" w:hAnsi="Times New Roman" w:eastAsia="宋体" w:cs="Times New Roman"/>
           <w:i w:val="0"/>
@@ -3885,7 +3969,7 @@
         <w:pStyle w:val="23"/>
         <w:spacing w:before="0" w:after="0" w:line="360" w:lineRule="auto"/>
         <w:ind w:firstLineChars="200"/>
-        <w:jc w:val="both"/>
+        <w:jc w:val="left"/>
         <w:rPr>
           <w:rFonts w:ascii="Times New Roman" w:hAnsi="Times New Roman" w:eastAsia="宋体" w:cs="Times New Roman"/>
           <w:i w:val="0"/>
@@ -3909,7 +3993,7 @@
         <w:pStyle w:val="3"/>
         <w:spacing w:before="0" w:after="0" w:line="360" w:lineRule="auto"/>
         <w:ind w:firstLineChars="200"/>
-        <w:jc w:val="both"/>
+        <w:jc w:val="left"/>
         <w:rPr>
           <w:rFonts w:ascii="Times New Roman" w:hAnsi="Times New Roman" w:eastAsia="宋体" w:cs="Times New Roman"/>
           <w:i w:val="0"/>
@@ -3933,7 +4017,7 @@
         <w:pStyle w:val="3"/>
         <w:spacing w:before="0" w:after="0" w:line="360" w:lineRule="auto"/>
         <w:ind w:firstLineChars="200"/>
-        <w:jc w:val="both"/>
+        <w:jc w:val="left"/>
         <w:rPr>
           <w:rFonts w:ascii="Times New Roman" w:hAnsi="Times New Roman" w:eastAsia="宋体" w:cs="Times New Roman"/>
           <w:i w:val="0"/>
@@ -3984,7 +4068,7 @@
         <w:pStyle w:val="23"/>
         <w:spacing w:before="0" w:after="0" w:line="360" w:lineRule="auto"/>
         <w:ind w:firstLineChars="200"/>
-        <w:jc w:val="both"/>
+        <w:jc w:val="left"/>
         <w:rPr>
           <w:rFonts w:ascii="Times New Roman" w:hAnsi="Times New Roman" w:eastAsia="宋体" w:cs="Times New Roman"/>
           <w:i w:val="0"/>
@@ -4033,7 +4117,7 @@
         <w:pStyle w:val="23"/>
         <w:spacing w:before="0" w:after="0" w:line="360" w:lineRule="auto"/>
         <w:ind w:firstLineChars="200"/>
-        <w:jc w:val="both"/>
+        <w:jc w:val="left"/>
         <w:rPr>
           <w:rFonts w:ascii="Times New Roman" w:hAnsi="Times New Roman" w:eastAsia="宋体" w:cs="Times New Roman"/>
           <w:i w:val="0"/>
@@ -4057,7 +4141,7 @@
         <w:pStyle w:val="3"/>
         <w:spacing w:before="0" w:after="0" w:line="360" w:lineRule="auto"/>
         <w:ind w:firstLineChars="200"/>
-        <w:jc w:val="both"/>
+        <w:jc w:val="left"/>
         <w:rPr>
           <w:rFonts w:ascii="Times New Roman" w:hAnsi="Times New Roman" w:eastAsia="宋体" w:cs="Times New Roman"/>
           <w:i w:val="0"/>
@@ -4081,7 +4165,7 @@
         <w:pStyle w:val="3"/>
         <w:spacing w:before="0" w:after="0" w:line="360" w:lineRule="auto"/>
         <w:ind w:firstLineChars="200"/>
-        <w:jc w:val="both"/>
+        <w:jc w:val="left"/>
         <w:rPr>
           <w:rFonts w:ascii="Times New Roman" w:hAnsi="Times New Roman" w:eastAsia="宋体" w:cs="Times New Roman"/>
           <w:i w:val="0"/>
@@ -4131,7 +4215,7 @@
         <w:pStyle w:val="23"/>
         <w:spacing w:before="0" w:after="0" w:line="360" w:lineRule="auto"/>
         <w:ind w:firstLineChars="200"/>
-        <w:jc w:val="both"/>
+        <w:jc w:val="left"/>
         <w:rPr>
           <w:rFonts w:ascii="Times New Roman" w:hAnsi="Times New Roman" w:eastAsia="宋体" w:cs="Times New Roman"/>
           <w:i w:val="0"/>
@@ -4155,7 +4239,7 @@
         <w:pStyle w:val="3"/>
         <w:spacing w:before="0" w:after="0" w:line="360" w:lineRule="auto"/>
         <w:ind w:firstLineChars="200"/>
-        <w:jc w:val="both"/>
+        <w:jc w:val="left"/>
         <w:rPr>
           <w:rFonts w:ascii="Times New Roman" w:hAnsi="Times New Roman" w:eastAsia="宋体" w:cs="Times New Roman"/>
           <w:i w:val="0"/>
@@ -4205,7 +4289,7 @@
         <w:pStyle w:val="23"/>
         <w:spacing w:before="0" w:after="0" w:line="360" w:lineRule="auto"/>
         <w:ind w:firstLineChars="200"/>
-        <w:jc w:val="both"/>
+        <w:jc w:val="left"/>
         <w:rPr>
           <w:rFonts w:ascii="Times New Roman" w:hAnsi="Times New Roman" w:eastAsia="宋体" w:cs="Times New Roman"/>
           <w:i w:val="0"/>
@@ -4229,7 +4313,7 @@
         <w:pStyle w:val="3"/>
         <w:spacing w:before="0" w:after="0" w:line="360" w:lineRule="auto"/>
         <w:ind w:firstLineChars="200"/>
-        <w:jc w:val="both"/>
+        <w:jc w:val="left"/>
         <w:rPr>
           <w:rFonts w:ascii="Times New Roman" w:hAnsi="Times New Roman" w:eastAsia="宋体" w:cs="Times New Roman"/>
           <w:i w:val="0"/>
@@ -4253,7 +4337,7 @@
         <w:pStyle w:val="3"/>
         <w:spacing w:before="0" w:after="0" w:line="360" w:lineRule="auto"/>
         <w:ind w:firstLineChars="200"/>
-        <w:jc w:val="both"/>
+        <w:jc w:val="left"/>
         <w:rPr>
           <w:rFonts w:ascii="Times New Roman" w:hAnsi="Times New Roman" w:eastAsia="宋体" w:cs="Times New Roman"/>
           <w:i w:val="0"/>
@@ -4304,7 +4388,7 @@
         <w:pStyle w:val="23"/>
         <w:spacing w:before="0" w:after="0" w:line="360" w:lineRule="auto"/>
         <w:ind w:firstLineChars="200"/>
-        <w:jc w:val="both"/>
+        <w:jc w:val="left"/>
         <w:rPr>
           <w:rFonts w:ascii="Times New Roman" w:hAnsi="Times New Roman" w:eastAsia="宋体" w:cs="Times New Roman"/>
           <w:i w:val="0"/>
@@ -4343,7 +4427,7 @@
           <w:sz w:val="21"/>
         </w:rPr>
         <w:pict>
-          <v:rect id="_x0000_i1029" o:spt="1" style="height:1.5pt;width:0pt;" coordsize="21600,21600" o:hr="t" o:hrstd="t" o:hralign="center">
+          <v:rect id="_x0000_i1029" o:spt="1" style="height:1.5pt;width:0pt;" coordsize="21600,21600" o:hr="t" o:hrstd="t">
             <v:path/>
             <v:fill focussize="0,0"/>
             <v:stroke/>
@@ -4361,7 +4445,7 @@
       <w:pPr>
         <w:pStyle w:val="4"/>
         <w:spacing w:before="240" w:after="240" w:line="360" w:lineRule="auto"/>
-        <w:jc w:val="center"/>
+        <w:jc w:val="left"/>
         <w:rPr>
           <w:rFonts w:ascii="Times New Roman" w:hAnsi="Times New Roman" w:eastAsia="黑体" w:cs="Times New Roman"/>
           <w:i w:val="0"/>
@@ -4387,7 +4471,7 @@
         <w:pStyle w:val="23"/>
         <w:spacing w:before="0" w:after="0" w:line="360" w:lineRule="auto"/>
         <w:ind w:firstLineChars="200"/>
-        <w:jc w:val="both"/>
+        <w:jc w:val="left"/>
         <w:rPr>
           <w:rFonts w:ascii="Times New Roman" w:hAnsi="Times New Roman" w:eastAsia="宋体" w:cs="Times New Roman"/>
           <w:i w:val="0"/>
@@ -4436,7 +4520,7 @@
         <w:pStyle w:val="23"/>
         <w:spacing w:before="0" w:after="0" w:line="360" w:lineRule="auto"/>
         <w:ind w:firstLineChars="200"/>
-        <w:jc w:val="both"/>
+        <w:jc w:val="left"/>
         <w:rPr>
           <w:rFonts w:ascii="Times New Roman" w:hAnsi="Times New Roman" w:eastAsia="宋体" w:cs="Times New Roman"/>
           <w:i w:val="0"/>
@@ -4486,7 +4570,7 @@
         <w:pStyle w:val="23"/>
         <w:spacing w:before="0" w:after="0" w:line="360" w:lineRule="auto"/>
         <w:ind w:firstLineChars="200"/>
-        <w:jc w:val="both"/>
+        <w:jc w:val="left"/>
         <w:rPr>
           <w:rFonts w:ascii="Times New Roman" w:hAnsi="Times New Roman" w:eastAsia="宋体" w:cs="Times New Roman"/>
           <w:i w:val="0"/>
@@ -4522,7 +4606,7 @@
         <w:pStyle w:val="3"/>
         <w:spacing w:before="0" w:after="0" w:line="360" w:lineRule="auto"/>
         <w:ind w:firstLineChars="200"/>
-        <w:jc w:val="both"/>
+        <w:jc w:val="left"/>
         <w:rPr>
           <w:rFonts w:ascii="Times New Roman" w:hAnsi="Times New Roman" w:eastAsia="宋体" w:cs="Times New Roman"/>
           <w:i w:val="0"/>
@@ -4558,7 +4642,7 @@
         <w:pStyle w:val="3"/>
         <w:spacing w:before="0" w:after="0" w:line="360" w:lineRule="auto"/>
         <w:ind w:firstLineChars="200"/>
-        <w:jc w:val="both"/>
+        <w:jc w:val="left"/>
         <w:rPr>
           <w:rFonts w:ascii="Times New Roman" w:hAnsi="Times New Roman" w:eastAsia="宋体" w:cs="Times New Roman"/>
           <w:i w:val="0"/>
@@ -4594,7 +4678,7 @@
         <w:pStyle w:val="3"/>
         <w:spacing w:before="0" w:after="0" w:line="360" w:lineRule="auto"/>
         <w:ind w:firstLineChars="200"/>
-        <w:jc w:val="both"/>
+        <w:jc w:val="left"/>
         <w:rPr>
           <w:rFonts w:ascii="Times New Roman" w:hAnsi="Times New Roman" w:eastAsia="宋体" w:cs="Times New Roman"/>
           <w:i w:val="0"/>
@@ -4618,7 +4702,7 @@
         <w:pStyle w:val="3"/>
         <w:spacing w:before="0" w:after="0" w:line="360" w:lineRule="auto"/>
         <w:ind w:firstLineChars="200"/>
-        <w:jc w:val="both"/>
+        <w:jc w:val="left"/>
         <w:rPr>
           <w:rFonts w:ascii="Times New Roman" w:hAnsi="Times New Roman" w:eastAsia="宋体" w:cs="Times New Roman"/>
           <w:i w:val="0"/>
@@ -4642,7 +4726,7 @@
         <w:pStyle w:val="3"/>
         <w:spacing w:before="0" w:after="0" w:line="360" w:lineRule="auto"/>
         <w:ind w:firstLineChars="200"/>
-        <w:jc w:val="both"/>
+        <w:jc w:val="left"/>
         <w:rPr>
           <w:rFonts w:ascii="Times New Roman" w:hAnsi="Times New Roman" w:eastAsia="宋体" w:cs="Times New Roman"/>
           <w:i w:val="0"/>
@@ -4678,7 +4762,7 @@
         <w:pStyle w:val="3"/>
         <w:spacing w:before="0" w:after="0" w:line="360" w:lineRule="auto"/>
         <w:ind w:firstLineChars="200"/>
-        <w:jc w:val="both"/>
+        <w:jc w:val="left"/>
         <w:rPr>
           <w:rFonts w:ascii="Times New Roman" w:hAnsi="Times New Roman" w:eastAsia="宋体" w:cs="Times New Roman"/>
           <w:i w:val="0"/>
@@ -4701,7 +4785,7 @@
       <w:pPr>
         <w:pStyle w:val="3"/>
         <w:spacing w:before="120" w:after="120" w:line="360" w:lineRule="auto"/>
-        <w:jc w:val="center"/>
+        <w:jc w:val="left"/>
         <w:rPr>
           <w:rFonts w:ascii="Times New Roman" w:hAnsi="Times New Roman" w:eastAsia="黑体" w:cs="Times New Roman"/>
           <w:i w:val="0"/>
@@ -4744,11 +4828,11 @@
         </w:tblCellMar>
       </w:tblPr>
       <w:tblGrid>
-        <w:gridCol w:w="781"/>
-        <w:gridCol w:w="1757"/>
-        <w:gridCol w:w="4489"/>
-        <w:gridCol w:w="1366"/>
-        <w:gridCol w:w="781"/>
+        <w:gridCol w:w="945"/>
+        <w:gridCol w:w="2046"/>
+        <w:gridCol w:w="3109"/>
+        <w:gridCol w:w="1773"/>
+        <w:gridCol w:w="1301"/>
       </w:tblGrid>
       <w:tr>
         <w:tblPrEx>
@@ -4771,11 +4855,14 @@
           <w:tblHeader/>
         </w:trPr>
         <w:tc>
-          <w:p>
-            <w:pPr>
-              <w:pStyle w:val="24"/>
-              <w:spacing w:before="0" w:after="0" w:line="312" w:lineRule="auto"/>
-              <w:jc w:val="center"/>
+          <w:tcPr>
+            <w:tcW w:w="515" w:type="pct"/>
+          </w:tcPr>
+          <w:p>
+            <w:pPr>
+              <w:pStyle w:val="24"/>
+              <w:spacing w:before="0" w:after="0" w:line="312" w:lineRule="auto"/>
+              <w:jc w:val="left"/>
               <w:rPr>
                 <w:rFonts w:ascii="Times New Roman" w:hAnsi="Times New Roman" w:eastAsia="宋体" w:cs="Times New Roman"/>
                 <w:i w:val="0"/>
@@ -4797,11 +4884,14 @@
           </w:p>
         </w:tc>
         <w:tc>
-          <w:p>
-            <w:pPr>
-              <w:pStyle w:val="24"/>
-              <w:spacing w:before="0" w:after="0" w:line="312" w:lineRule="auto"/>
-              <w:jc w:val="center"/>
+          <w:tcPr>
+            <w:tcW w:w="1115" w:type="pct"/>
+          </w:tcPr>
+          <w:p>
+            <w:pPr>
+              <w:pStyle w:val="24"/>
+              <w:spacing w:before="0" w:after="0" w:line="312" w:lineRule="auto"/>
+              <w:jc w:val="left"/>
               <w:rPr>
                 <w:rFonts w:ascii="Times New Roman" w:hAnsi="Times New Roman" w:eastAsia="宋体" w:cs="Times New Roman"/>
                 <w:i w:val="0"/>
@@ -4823,11 +4913,14 @@
           </w:p>
         </w:tc>
         <w:tc>
-          <w:p>
-            <w:pPr>
-              <w:pStyle w:val="24"/>
-              <w:spacing w:before="0" w:after="0" w:line="312" w:lineRule="auto"/>
-              <w:jc w:val="center"/>
+          <w:tcPr>
+            <w:tcW w:w="1694" w:type="pct"/>
+          </w:tcPr>
+          <w:p>
+            <w:pPr>
+              <w:pStyle w:val="24"/>
+              <w:spacing w:before="0" w:after="0" w:line="312" w:lineRule="auto"/>
+              <w:jc w:val="left"/>
               <w:rPr>
                 <w:rFonts w:ascii="Times New Roman" w:hAnsi="Times New Roman" w:eastAsia="宋体" w:cs="Times New Roman"/>
                 <w:i w:val="0"/>
@@ -4849,11 +4942,14 @@
           </w:p>
         </w:tc>
         <w:tc>
-          <w:p>
-            <w:pPr>
-              <w:pStyle w:val="24"/>
-              <w:spacing w:before="0" w:after="0" w:line="312" w:lineRule="auto"/>
-              <w:jc w:val="center"/>
+          <w:tcPr>
+            <w:tcW w:w="966" w:type="pct"/>
+          </w:tcPr>
+          <w:p>
+            <w:pPr>
+              <w:pStyle w:val="24"/>
+              <w:spacing w:before="0" w:after="0" w:line="312" w:lineRule="auto"/>
+              <w:jc w:val="left"/>
               <w:rPr>
                 <w:rFonts w:ascii="Times New Roman" w:hAnsi="Times New Roman" w:eastAsia="宋体" w:cs="Times New Roman"/>
                 <w:i w:val="0"/>
@@ -4875,11 +4971,14 @@
           </w:p>
         </w:tc>
         <w:tc>
-          <w:p>
-            <w:pPr>
-              <w:pStyle w:val="24"/>
-              <w:spacing w:before="0" w:after="0" w:line="312" w:lineRule="auto"/>
-              <w:jc w:val="center"/>
+          <w:tcPr>
+            <w:tcW w:w="709" w:type="pct"/>
+          </w:tcPr>
+          <w:p>
+            <w:pPr>
+              <w:pStyle w:val="24"/>
+              <w:spacing w:before="0" w:after="0" w:line="312" w:lineRule="auto"/>
+              <w:jc w:val="left"/>
               <w:rPr>
                 <w:rFonts w:ascii="Times New Roman" w:hAnsi="Times New Roman" w:eastAsia="宋体" w:cs="Times New Roman"/>
                 <w:i w:val="0"/>
@@ -4919,11 +5018,14 @@
           </w:tblCellMar>
         </w:tblPrEx>
         <w:tc>
-          <w:p>
-            <w:pPr>
-              <w:pStyle w:val="24"/>
-              <w:spacing w:before="0" w:after="0" w:line="312" w:lineRule="auto"/>
-              <w:jc w:val="center"/>
+          <w:tcPr>
+            <w:tcW w:w="515" w:type="pct"/>
+          </w:tcPr>
+          <w:p>
+            <w:pPr>
+              <w:pStyle w:val="24"/>
+              <w:spacing w:before="0" w:after="0" w:line="312" w:lineRule="auto"/>
+              <w:jc w:val="left"/>
               <w:rPr>
                 <w:rFonts w:ascii="Times New Roman" w:hAnsi="Times New Roman" w:eastAsia="宋体" w:cs="Times New Roman"/>
                 <w:i w:val="0"/>
@@ -4944,11 +5046,14 @@
           </w:p>
         </w:tc>
         <w:tc>
-          <w:p>
-            <w:pPr>
-              <w:pStyle w:val="24"/>
-              <w:spacing w:before="0" w:after="0" w:line="312" w:lineRule="auto"/>
-              <w:jc w:val="center"/>
+          <w:tcPr>
+            <w:tcW w:w="1115" w:type="pct"/>
+          </w:tcPr>
+          <w:p>
+            <w:pPr>
+              <w:pStyle w:val="24"/>
+              <w:spacing w:before="0" w:after="0" w:line="312" w:lineRule="auto"/>
+              <w:jc w:val="left"/>
               <w:rPr>
                 <w:rFonts w:ascii="Times New Roman" w:hAnsi="Times New Roman" w:eastAsia="宋体" w:cs="Times New Roman"/>
                 <w:i w:val="0"/>
@@ -4969,11 +5074,14 @@
           </w:p>
         </w:tc>
         <w:tc>
-          <w:p>
-            <w:pPr>
-              <w:pStyle w:val="24"/>
-              <w:spacing w:before="0" w:after="0" w:line="312" w:lineRule="auto"/>
-              <w:jc w:val="center"/>
+          <w:tcPr>
+            <w:tcW w:w="1694" w:type="pct"/>
+          </w:tcPr>
+          <w:p>
+            <w:pPr>
+              <w:pStyle w:val="24"/>
+              <w:spacing w:before="0" w:after="0" w:line="312" w:lineRule="auto"/>
+              <w:jc w:val="left"/>
               <w:rPr>
                 <w:rFonts w:ascii="Times New Roman" w:hAnsi="Times New Roman" w:eastAsia="宋体" w:cs="Times New Roman"/>
                 <w:i w:val="0"/>
@@ -4994,11 +5102,14 @@
           </w:p>
         </w:tc>
         <w:tc>
-          <w:p>
-            <w:pPr>
-              <w:pStyle w:val="24"/>
-              <w:spacing w:before="0" w:after="0" w:line="312" w:lineRule="auto"/>
-              <w:jc w:val="center"/>
+          <w:tcPr>
+            <w:tcW w:w="966" w:type="pct"/>
+          </w:tcPr>
+          <w:p>
+            <w:pPr>
+              <w:pStyle w:val="24"/>
+              <w:spacing w:before="0" w:after="0" w:line="312" w:lineRule="auto"/>
+              <w:jc w:val="left"/>
               <w:rPr>
                 <w:rFonts w:ascii="Times New Roman" w:hAnsi="Times New Roman" w:eastAsia="宋体" w:cs="Times New Roman"/>
                 <w:i w:val="0"/>
@@ -5019,11 +5130,14 @@
           </w:p>
         </w:tc>
         <w:tc>
-          <w:p>
-            <w:pPr>
-              <w:pStyle w:val="24"/>
-              <w:spacing w:before="0" w:after="0" w:line="312" w:lineRule="auto"/>
-              <w:jc w:val="center"/>
+          <w:tcPr>
+            <w:tcW w:w="709" w:type="pct"/>
+          </w:tcPr>
+          <w:p>
+            <w:pPr>
+              <w:pStyle w:val="24"/>
+              <w:spacing w:before="0" w:after="0" w:line="312" w:lineRule="auto"/>
+              <w:jc w:val="left"/>
               <w:rPr>
                 <w:rFonts w:ascii="Times New Roman" w:hAnsi="Times New Roman" w:eastAsia="宋体" w:cs="Times New Roman"/>
                 <w:i w:val="0"/>
@@ -5062,11 +5176,14 @@
           </w:tblCellMar>
         </w:tblPrEx>
         <w:tc>
-          <w:p>
-            <w:pPr>
-              <w:pStyle w:val="24"/>
-              <w:spacing w:before="0" w:after="0" w:line="312" w:lineRule="auto"/>
-              <w:jc w:val="center"/>
+          <w:tcPr>
+            <w:tcW w:w="515" w:type="pct"/>
+          </w:tcPr>
+          <w:p>
+            <w:pPr>
+              <w:pStyle w:val="24"/>
+              <w:spacing w:before="0" w:after="0" w:line="312" w:lineRule="auto"/>
+              <w:jc w:val="left"/>
               <w:rPr>
                 <w:rFonts w:ascii="Times New Roman" w:hAnsi="Times New Roman" w:eastAsia="宋体" w:cs="Times New Roman"/>
                 <w:i w:val="0"/>
@@ -5087,11 +5204,14 @@
           </w:p>
         </w:tc>
         <w:tc>
-          <w:p>
-            <w:pPr>
-              <w:pStyle w:val="24"/>
-              <w:spacing w:before="0" w:after="0" w:line="312" w:lineRule="auto"/>
-              <w:jc w:val="center"/>
+          <w:tcPr>
+            <w:tcW w:w="1115" w:type="pct"/>
+          </w:tcPr>
+          <w:p>
+            <w:pPr>
+              <w:pStyle w:val="24"/>
+              <w:spacing w:before="0" w:after="0" w:line="312" w:lineRule="auto"/>
+              <w:jc w:val="left"/>
               <w:rPr>
                 <w:rFonts w:ascii="Times New Roman" w:hAnsi="Times New Roman" w:eastAsia="宋体" w:cs="Times New Roman"/>
                 <w:i w:val="0"/>
@@ -5112,11 +5232,14 @@
           </w:p>
         </w:tc>
         <w:tc>
-          <w:p>
-            <w:pPr>
-              <w:pStyle w:val="24"/>
-              <w:spacing w:before="0" w:after="0" w:line="312" w:lineRule="auto"/>
-              <w:jc w:val="center"/>
+          <w:tcPr>
+            <w:tcW w:w="1694" w:type="pct"/>
+          </w:tcPr>
+          <w:p>
+            <w:pPr>
+              <w:pStyle w:val="24"/>
+              <w:spacing w:before="0" w:after="0" w:line="312" w:lineRule="auto"/>
+              <w:jc w:val="left"/>
               <w:rPr>
                 <w:rFonts w:ascii="Times New Roman" w:hAnsi="Times New Roman" w:eastAsia="宋体" w:cs="Times New Roman"/>
                 <w:i w:val="0"/>
@@ -5137,11 +5260,14 @@
           </w:p>
         </w:tc>
         <w:tc>
-          <w:p>
-            <w:pPr>
-              <w:pStyle w:val="24"/>
-              <w:spacing w:before="0" w:after="0" w:line="312" w:lineRule="auto"/>
-              <w:jc w:val="center"/>
+          <w:tcPr>
+            <w:tcW w:w="966" w:type="pct"/>
+          </w:tcPr>
+          <w:p>
+            <w:pPr>
+              <w:pStyle w:val="24"/>
+              <w:spacing w:before="0" w:after="0" w:line="312" w:lineRule="auto"/>
+              <w:jc w:val="left"/>
               <w:rPr>
                 <w:rFonts w:ascii="Times New Roman" w:hAnsi="Times New Roman" w:eastAsia="宋体" w:cs="Times New Roman"/>
                 <w:i w:val="0"/>
@@ -5162,11 +5288,14 @@
           </w:p>
         </w:tc>
         <w:tc>
-          <w:p>
-            <w:pPr>
-              <w:pStyle w:val="24"/>
-              <w:spacing w:before="0" w:after="0" w:line="312" w:lineRule="auto"/>
-              <w:jc w:val="center"/>
+          <w:tcPr>
+            <w:tcW w:w="709" w:type="pct"/>
+          </w:tcPr>
+          <w:p>
+            <w:pPr>
+              <w:pStyle w:val="24"/>
+              <w:spacing w:before="0" w:after="0" w:line="312" w:lineRule="auto"/>
+              <w:jc w:val="left"/>
               <w:rPr>
                 <w:rFonts w:ascii="Times New Roman" w:hAnsi="Times New Roman" w:eastAsia="宋体" w:cs="Times New Roman"/>
                 <w:i w:val="0"/>
@@ -5205,11 +5334,14 @@
           </w:tblCellMar>
         </w:tblPrEx>
         <w:tc>
-          <w:p>
-            <w:pPr>
-              <w:pStyle w:val="24"/>
-              <w:spacing w:before="0" w:after="0" w:line="312" w:lineRule="auto"/>
-              <w:jc w:val="center"/>
+          <w:tcPr>
+            <w:tcW w:w="515" w:type="pct"/>
+          </w:tcPr>
+          <w:p>
+            <w:pPr>
+              <w:pStyle w:val="24"/>
+              <w:spacing w:before="0" w:after="0" w:line="312" w:lineRule="auto"/>
+              <w:jc w:val="left"/>
               <w:rPr>
                 <w:rFonts w:ascii="Times New Roman" w:hAnsi="Times New Roman" w:eastAsia="宋体" w:cs="Times New Roman"/>
                 <w:i w:val="0"/>
@@ -5230,11 +5362,14 @@
           </w:p>
         </w:tc>
         <w:tc>
-          <w:p>
-            <w:pPr>
-              <w:pStyle w:val="24"/>
-              <w:spacing w:before="0" w:after="0" w:line="312" w:lineRule="auto"/>
-              <w:jc w:val="center"/>
+          <w:tcPr>
+            <w:tcW w:w="1115" w:type="pct"/>
+          </w:tcPr>
+          <w:p>
+            <w:pPr>
+              <w:pStyle w:val="24"/>
+              <w:spacing w:before="0" w:after="0" w:line="312" w:lineRule="auto"/>
+              <w:jc w:val="left"/>
               <w:rPr>
                 <w:rFonts w:ascii="Times New Roman" w:hAnsi="Times New Roman" w:eastAsia="宋体" w:cs="Times New Roman"/>
                 <w:i w:val="0"/>
@@ -5255,11 +5390,14 @@
           </w:p>
         </w:tc>
         <w:tc>
-          <w:p>
-            <w:pPr>
-              <w:pStyle w:val="24"/>
-              <w:spacing w:before="0" w:after="0" w:line="312" w:lineRule="auto"/>
-              <w:jc w:val="center"/>
+          <w:tcPr>
+            <w:tcW w:w="1694" w:type="pct"/>
+          </w:tcPr>
+          <w:p>
+            <w:pPr>
+              <w:pStyle w:val="24"/>
+              <w:spacing w:before="0" w:after="0" w:line="312" w:lineRule="auto"/>
+              <w:jc w:val="left"/>
               <w:rPr>
                 <w:rFonts w:ascii="Times New Roman" w:hAnsi="Times New Roman" w:eastAsia="宋体" w:cs="Times New Roman"/>
                 <w:i w:val="0"/>
@@ -5280,11 +5418,14 @@
           </w:p>
         </w:tc>
         <w:tc>
-          <w:p>
-            <w:pPr>
-              <w:pStyle w:val="24"/>
-              <w:spacing w:before="0" w:after="0" w:line="312" w:lineRule="auto"/>
-              <w:jc w:val="center"/>
+          <w:tcPr>
+            <w:tcW w:w="966" w:type="pct"/>
+          </w:tcPr>
+          <w:p>
+            <w:pPr>
+              <w:pStyle w:val="24"/>
+              <w:spacing w:before="0" w:after="0" w:line="312" w:lineRule="auto"/>
+              <w:jc w:val="left"/>
               <w:rPr>
                 <w:rFonts w:ascii="Times New Roman" w:hAnsi="Times New Roman" w:eastAsia="宋体" w:cs="Times New Roman"/>
                 <w:i w:val="0"/>
@@ -5305,11 +5446,14 @@
           </w:p>
         </w:tc>
         <w:tc>
-          <w:p>
-            <w:pPr>
-              <w:pStyle w:val="24"/>
-              <w:spacing w:before="0" w:after="0" w:line="312" w:lineRule="auto"/>
-              <w:jc w:val="center"/>
+          <w:tcPr>
+            <w:tcW w:w="709" w:type="pct"/>
+          </w:tcPr>
+          <w:p>
+            <w:pPr>
+              <w:pStyle w:val="24"/>
+              <w:spacing w:before="0" w:after="0" w:line="312" w:lineRule="auto"/>
+              <w:jc w:val="left"/>
               <w:rPr>
                 <w:rFonts w:ascii="Times New Roman" w:hAnsi="Times New Roman" w:eastAsia="宋体" w:cs="Times New Roman"/>
                 <w:i w:val="0"/>
@@ -5362,7 +5506,7 @@
         <w:pStyle w:val="23"/>
         <w:spacing w:before="0" w:after="0" w:line="360" w:lineRule="auto"/>
         <w:ind w:firstLineChars="200"/>
-        <w:jc w:val="both"/>
+        <w:jc w:val="left"/>
         <w:rPr>
           <w:rFonts w:ascii="Times New Roman" w:hAnsi="Times New Roman" w:eastAsia="宋体" w:cs="Times New Roman"/>
           <w:i w:val="0"/>
@@ -5398,7 +5542,7 @@
         <w:pStyle w:val="3"/>
         <w:spacing w:before="0" w:after="0" w:line="360" w:lineRule="auto"/>
         <w:ind w:firstLineChars="200"/>
-        <w:jc w:val="both"/>
+        <w:jc w:val="left"/>
         <w:rPr>
           <w:rFonts w:ascii="Times New Roman" w:hAnsi="Times New Roman" w:eastAsia="宋体" w:cs="Times New Roman"/>
           <w:i w:val="0"/>
@@ -5434,7 +5578,7 @@
         <w:pStyle w:val="3"/>
         <w:spacing w:before="0" w:after="0" w:line="360" w:lineRule="auto"/>
         <w:ind w:firstLineChars="200"/>
-        <w:jc w:val="both"/>
+        <w:jc w:val="left"/>
         <w:rPr>
           <w:rFonts w:ascii="Times New Roman" w:hAnsi="Times New Roman" w:eastAsia="宋体" w:cs="Times New Roman"/>
           <w:i w:val="0"/>
@@ -5491,7 +5635,7 @@
         <w:pStyle w:val="3"/>
         <w:spacing w:before="0" w:after="0" w:line="360" w:lineRule="auto"/>
         <w:ind w:firstLineChars="200"/>
-        <w:jc w:val="both"/>
+        <w:jc w:val="left"/>
         <w:rPr>
           <w:rFonts w:ascii="Times New Roman" w:hAnsi="Times New Roman" w:eastAsia="宋体" w:cs="Times New Roman"/>
           <w:i w:val="0"/>
@@ -5515,7 +5659,7 @@
         <w:pStyle w:val="3"/>
         <w:spacing w:before="0" w:after="0" w:line="360" w:lineRule="auto"/>
         <w:ind w:firstLineChars="200"/>
-        <w:jc w:val="both"/>
+        <w:jc w:val="left"/>
         <w:rPr>
           <w:rFonts w:ascii="Times New Roman" w:hAnsi="Times New Roman" w:eastAsia="宋体" w:cs="Times New Roman"/>
           <w:i w:val="0"/>
@@ -5551,7 +5695,7 @@
         <w:pStyle w:val="3"/>
         <w:spacing w:before="0" w:after="0" w:line="360" w:lineRule="auto"/>
         <w:ind w:firstLineChars="200"/>
-        <w:jc w:val="both"/>
+        <w:jc w:val="left"/>
         <w:rPr>
           <w:rFonts w:ascii="Times New Roman" w:hAnsi="Times New Roman" w:eastAsia="宋体" w:cs="Times New Roman"/>
           <w:i w:val="0"/>
@@ -5574,7 +5718,7 @@
       <w:pPr>
         <w:pStyle w:val="3"/>
         <w:spacing w:before="120" w:after="120" w:line="360" w:lineRule="auto"/>
-        <w:jc w:val="center"/>
+        <w:jc w:val="left"/>
         <w:rPr>
           <w:rFonts w:ascii="Times New Roman" w:hAnsi="Times New Roman" w:eastAsia="黑体" w:cs="Times New Roman"/>
           <w:i w:val="0"/>
@@ -5651,7 +5795,7 @@
             <w:pPr>
               <w:pStyle w:val="24"/>
               <w:spacing w:before="0" w:after="0" w:line="312" w:lineRule="auto"/>
-              <w:jc w:val="center"/>
+              <w:jc w:val="left"/>
               <w:rPr>
                 <w:rFonts w:ascii="Times New Roman" w:hAnsi="Times New Roman" w:eastAsia="宋体" w:cs="Times New Roman"/>
                 <w:i w:val="0"/>
@@ -5680,7 +5824,7 @@
             <w:pPr>
               <w:pStyle w:val="24"/>
               <w:spacing w:before="0" w:after="0" w:line="312" w:lineRule="auto"/>
-              <w:jc w:val="center"/>
+              <w:jc w:val="left"/>
               <w:rPr>
                 <w:rFonts w:ascii="Times New Roman" w:hAnsi="Times New Roman" w:eastAsia="宋体" w:cs="Times New Roman"/>
                 <w:i w:val="0"/>
@@ -5706,7 +5850,7 @@
             <w:pPr>
               <w:pStyle w:val="24"/>
               <w:spacing w:before="0" w:after="0" w:line="312" w:lineRule="auto"/>
-              <w:jc w:val="center"/>
+              <w:jc w:val="left"/>
               <w:rPr>
                 <w:rFonts w:ascii="Times New Roman" w:hAnsi="Times New Roman" w:eastAsia="宋体" w:cs="Times New Roman"/>
                 <w:i w:val="0"/>
@@ -5732,7 +5876,7 @@
             <w:pPr>
               <w:pStyle w:val="24"/>
               <w:spacing w:before="0" w:after="0" w:line="312" w:lineRule="auto"/>
-              <w:jc w:val="center"/>
+              <w:jc w:val="left"/>
               <w:rPr>
                 <w:rFonts w:ascii="Times New Roman" w:hAnsi="Times New Roman" w:eastAsia="宋体" w:cs="Times New Roman"/>
                 <w:i w:val="0"/>
@@ -5758,7 +5902,7 @@
             <w:pPr>
               <w:pStyle w:val="24"/>
               <w:spacing w:before="0" w:after="0" w:line="312" w:lineRule="auto"/>
-              <w:jc w:val="center"/>
+              <w:jc w:val="left"/>
               <w:rPr>
                 <w:rFonts w:ascii="Times New Roman" w:hAnsi="Times New Roman" w:eastAsia="宋体" w:cs="Times New Roman"/>
                 <w:i w:val="0"/>
@@ -5807,7 +5951,7 @@
             <w:pPr>
               <w:pStyle w:val="24"/>
               <w:spacing w:before="0" w:after="0" w:line="312" w:lineRule="auto"/>
-              <w:jc w:val="center"/>
+              <w:jc w:val="left"/>
               <w:rPr>
                 <w:rFonts w:ascii="Times New Roman" w:hAnsi="Times New Roman" w:eastAsia="宋体" w:cs="Times New Roman"/>
                 <w:i w:val="0"/>
@@ -5835,7 +5979,7 @@
             <w:pPr>
               <w:pStyle w:val="24"/>
               <w:spacing w:before="0" w:after="0" w:line="312" w:lineRule="auto"/>
-              <w:jc w:val="center"/>
+              <w:jc w:val="left"/>
               <w:rPr>
                 <w:rFonts w:ascii="Times New Roman" w:hAnsi="Times New Roman" w:eastAsia="宋体" w:cs="Times New Roman"/>
                 <w:i w:val="0"/>
@@ -5860,7 +6004,7 @@
             <w:pPr>
               <w:pStyle w:val="24"/>
               <w:spacing w:before="0" w:after="0" w:line="312" w:lineRule="auto"/>
-              <w:jc w:val="center"/>
+              <w:jc w:val="left"/>
               <w:rPr>
                 <w:rFonts w:ascii="Times New Roman" w:hAnsi="Times New Roman" w:eastAsia="宋体" w:cs="Times New Roman"/>
                 <w:i w:val="0"/>
@@ -5885,7 +6029,7 @@
             <w:pPr>
               <w:pStyle w:val="24"/>
               <w:spacing w:before="0" w:after="0" w:line="312" w:lineRule="auto"/>
-              <w:jc w:val="center"/>
+              <w:jc w:val="left"/>
               <w:rPr>
                 <w:rFonts w:ascii="Times New Roman" w:hAnsi="Times New Roman" w:eastAsia="宋体" w:cs="Times New Roman"/>
                 <w:i w:val="0"/>
@@ -5910,7 +6054,7 @@
             <w:pPr>
               <w:pStyle w:val="24"/>
               <w:spacing w:before="0" w:after="0" w:line="312" w:lineRule="auto"/>
-              <w:jc w:val="center"/>
+              <w:jc w:val="left"/>
               <w:rPr>
                 <w:rFonts w:ascii="Times New Roman" w:hAnsi="Times New Roman" w:eastAsia="宋体" w:cs="Times New Roman"/>
                 <w:i w:val="0"/>
@@ -5958,7 +6102,7 @@
             <w:pPr>
               <w:pStyle w:val="24"/>
               <w:spacing w:before="0" w:after="0" w:line="312" w:lineRule="auto"/>
-              <w:jc w:val="center"/>
+              <w:jc w:val="left"/>
               <w:rPr>
                 <w:rFonts w:ascii="Times New Roman" w:hAnsi="Times New Roman" w:eastAsia="宋体" w:cs="Times New Roman"/>
                 <w:i w:val="0"/>
@@ -5976,7 +6120,7 @@
             <w:pPr>
               <w:pStyle w:val="24"/>
               <w:spacing w:before="0" w:after="0" w:line="312" w:lineRule="auto"/>
-              <w:jc w:val="center"/>
+              <w:jc w:val="left"/>
               <w:rPr>
                 <w:rFonts w:ascii="Times New Roman" w:hAnsi="Times New Roman" w:eastAsia="宋体" w:cs="Times New Roman"/>
                 <w:i w:val="0"/>
@@ -6001,7 +6145,7 @@
             <w:pPr>
               <w:pStyle w:val="24"/>
               <w:spacing w:before="0" w:after="0" w:line="312" w:lineRule="auto"/>
-              <w:jc w:val="center"/>
+              <w:jc w:val="left"/>
               <w:rPr>
                 <w:rFonts w:ascii="Times New Roman" w:hAnsi="Times New Roman" w:eastAsia="宋体" w:cs="Times New Roman"/>
                 <w:i w:val="0"/>
@@ -6026,7 +6170,7 @@
             <w:pPr>
               <w:pStyle w:val="24"/>
               <w:spacing w:before="0" w:after="0" w:line="312" w:lineRule="auto"/>
-              <w:jc w:val="center"/>
+              <w:jc w:val="left"/>
               <w:rPr>
                 <w:rFonts w:ascii="Times New Roman" w:hAnsi="Times New Roman" w:eastAsia="宋体" w:cs="Times New Roman"/>
                 <w:i w:val="0"/>
@@ -6051,7 +6195,7 @@
             <w:pPr>
               <w:pStyle w:val="24"/>
               <w:spacing w:before="0" w:after="0" w:line="312" w:lineRule="auto"/>
-              <w:jc w:val="center"/>
+              <w:jc w:val="left"/>
               <w:rPr>
                 <w:rFonts w:ascii="Times New Roman" w:hAnsi="Times New Roman" w:eastAsia="宋体" w:cs="Times New Roman"/>
                 <w:i w:val="0"/>
@@ -6099,7 +6243,7 @@
             <w:pPr>
               <w:pStyle w:val="24"/>
               <w:spacing w:before="0" w:after="0" w:line="312" w:lineRule="auto"/>
-              <w:jc w:val="center"/>
+              <w:jc w:val="left"/>
               <w:rPr>
                 <w:rFonts w:ascii="Times New Roman" w:hAnsi="Times New Roman" w:eastAsia="宋体" w:cs="Times New Roman"/>
                 <w:i w:val="0"/>
@@ -6117,7 +6261,7 @@
             <w:pPr>
               <w:pStyle w:val="24"/>
               <w:spacing w:before="0" w:after="0" w:line="312" w:lineRule="auto"/>
-              <w:jc w:val="center"/>
+              <w:jc w:val="left"/>
               <w:rPr>
                 <w:rFonts w:ascii="Times New Roman" w:hAnsi="Times New Roman" w:eastAsia="宋体" w:cs="Times New Roman"/>
                 <w:i w:val="0"/>
@@ -6142,7 +6286,7 @@
             <w:pPr>
               <w:pStyle w:val="24"/>
               <w:spacing w:before="0" w:after="0" w:line="312" w:lineRule="auto"/>
-              <w:jc w:val="center"/>
+              <w:jc w:val="left"/>
               <w:rPr>
                 <w:rFonts w:ascii="Times New Roman" w:hAnsi="Times New Roman" w:eastAsia="宋体" w:cs="Times New Roman"/>
                 <w:i w:val="0"/>
@@ -6167,7 +6311,7 @@
             <w:pPr>
               <w:pStyle w:val="24"/>
               <w:spacing w:before="0" w:after="0" w:line="312" w:lineRule="auto"/>
-              <w:jc w:val="center"/>
+              <w:jc w:val="left"/>
               <w:rPr>
                 <w:rFonts w:ascii="Times New Roman" w:hAnsi="Times New Roman" w:eastAsia="宋体" w:cs="Times New Roman"/>
                 <w:i w:val="0"/>
@@ -6192,7 +6336,7 @@
             <w:pPr>
               <w:pStyle w:val="24"/>
               <w:spacing w:before="0" w:after="0" w:line="312" w:lineRule="auto"/>
-              <w:jc w:val="center"/>
+              <w:jc w:val="left"/>
               <w:rPr>
                 <w:rFonts w:ascii="Times New Roman" w:hAnsi="Times New Roman" w:eastAsia="宋体" w:cs="Times New Roman"/>
                 <w:i w:val="0"/>
@@ -6238,7 +6382,7 @@
             <w:pPr>
               <w:pStyle w:val="24"/>
               <w:spacing w:before="0" w:after="0" w:line="312" w:lineRule="auto"/>
-              <w:jc w:val="center"/>
+              <w:jc w:val="left"/>
               <w:rPr>
                 <w:rFonts w:ascii="Times New Roman" w:hAnsi="Times New Roman" w:eastAsia="宋体" w:cs="Times New Roman"/>
                 <w:i w:val="0"/>
@@ -6266,7 +6410,7 @@
             <w:pPr>
               <w:pStyle w:val="24"/>
               <w:spacing w:before="0" w:after="0" w:line="312" w:lineRule="auto"/>
-              <w:jc w:val="center"/>
+              <w:jc w:val="left"/>
               <w:rPr>
                 <w:rFonts w:ascii="Times New Roman" w:hAnsi="Times New Roman" w:eastAsia="宋体" w:cs="Times New Roman"/>
                 <w:i w:val="0"/>
@@ -6291,7 +6435,7 @@
             <w:pPr>
               <w:pStyle w:val="24"/>
               <w:spacing w:before="0" w:after="0" w:line="312" w:lineRule="auto"/>
-              <w:jc w:val="center"/>
+              <w:jc w:val="left"/>
               <w:rPr>
                 <w:rFonts w:ascii="Times New Roman" w:hAnsi="Times New Roman" w:eastAsia="宋体" w:cs="Times New Roman"/>
                 <w:i w:val="0"/>
@@ -6316,7 +6460,7 @@
             <w:pPr>
               <w:pStyle w:val="24"/>
               <w:spacing w:before="0" w:after="0" w:line="312" w:lineRule="auto"/>
-              <w:jc w:val="center"/>
+              <w:jc w:val="left"/>
               <w:rPr>
                 <w:rFonts w:ascii="Times New Roman" w:hAnsi="Times New Roman" w:eastAsia="宋体" w:cs="Times New Roman"/>
                 <w:i w:val="0"/>
@@ -6341,7 +6485,7 @@
             <w:pPr>
               <w:pStyle w:val="24"/>
               <w:spacing w:before="0" w:after="0" w:line="312" w:lineRule="auto"/>
-              <w:jc w:val="center"/>
+              <w:jc w:val="left"/>
               <w:rPr>
                 <w:rFonts w:ascii="Times New Roman" w:hAnsi="Times New Roman" w:eastAsia="宋体" w:cs="Times New Roman"/>
                 <w:i w:val="0"/>
@@ -6387,7 +6531,7 @@
             <w:pPr>
               <w:pStyle w:val="24"/>
               <w:spacing w:before="0" w:after="0" w:line="312" w:lineRule="auto"/>
-              <w:jc w:val="center"/>
+              <w:jc w:val="left"/>
               <w:rPr>
                 <w:rFonts w:ascii="Times New Roman" w:hAnsi="Times New Roman" w:eastAsia="宋体" w:cs="Times New Roman"/>
                 <w:i w:val="0"/>
@@ -6415,7 +6559,7 @@
             <w:pPr>
               <w:pStyle w:val="24"/>
               <w:spacing w:before="0" w:after="0" w:line="312" w:lineRule="auto"/>
-              <w:jc w:val="center"/>
+              <w:jc w:val="left"/>
               <w:rPr>
                 <w:rFonts w:ascii="Times New Roman" w:hAnsi="Times New Roman" w:eastAsia="宋体" w:cs="Times New Roman"/>
                 <w:i w:val="0"/>
@@ -6440,7 +6584,7 @@
             <w:pPr>
               <w:pStyle w:val="24"/>
               <w:spacing w:before="0" w:after="0" w:line="312" w:lineRule="auto"/>
-              <w:jc w:val="center"/>
+              <w:jc w:val="left"/>
               <w:rPr>
                 <w:rFonts w:ascii="Times New Roman" w:hAnsi="Times New Roman" w:eastAsia="宋体" w:cs="Times New Roman"/>
                 <w:i w:val="0"/>
@@ -6465,7 +6609,7 @@
             <w:pPr>
               <w:pStyle w:val="24"/>
               <w:spacing w:before="0" w:after="0" w:line="312" w:lineRule="auto"/>
-              <w:jc w:val="center"/>
+              <w:jc w:val="left"/>
               <w:rPr>
                 <w:rFonts w:ascii="Times New Roman" w:hAnsi="Times New Roman" w:eastAsia="宋体" w:cs="Times New Roman"/>
                 <w:i w:val="0"/>
@@ -6490,7 +6634,7 @@
             <w:pPr>
               <w:pStyle w:val="24"/>
               <w:spacing w:before="0" w:after="0" w:line="312" w:lineRule="auto"/>
-              <w:jc w:val="center"/>
+              <w:jc w:val="left"/>
               <w:rPr>
                 <w:rFonts w:ascii="Times New Roman" w:hAnsi="Times New Roman" w:eastAsia="宋体" w:cs="Times New Roman"/>
                 <w:i w:val="0"/>
@@ -6536,7 +6680,7 @@
             <w:pPr>
               <w:pStyle w:val="24"/>
               <w:spacing w:before="0" w:after="0" w:line="312" w:lineRule="auto"/>
-              <w:jc w:val="center"/>
+              <w:jc w:val="left"/>
               <w:rPr>
                 <w:rFonts w:ascii="Times New Roman" w:hAnsi="Times New Roman" w:eastAsia="宋体" w:cs="Times New Roman"/>
                 <w:i w:val="0"/>
@@ -6564,7 +6708,7 @@
             <w:pPr>
               <w:pStyle w:val="24"/>
               <w:spacing w:before="0" w:after="0" w:line="312" w:lineRule="auto"/>
-              <w:jc w:val="center"/>
+              <w:jc w:val="left"/>
               <w:rPr>
                 <w:rFonts w:ascii="Times New Roman" w:hAnsi="Times New Roman" w:eastAsia="宋体" w:cs="Times New Roman"/>
                 <w:i w:val="0"/>
@@ -6589,7 +6733,7 @@
             <w:pPr>
               <w:pStyle w:val="24"/>
               <w:spacing w:before="0" w:after="0" w:line="312" w:lineRule="auto"/>
-              <w:jc w:val="center"/>
+              <w:jc w:val="left"/>
               <w:rPr>
                 <w:rFonts w:ascii="Times New Roman" w:hAnsi="Times New Roman" w:eastAsia="宋体" w:cs="Times New Roman"/>
                 <w:i w:val="0"/>
@@ -6614,7 +6758,7 @@
             <w:pPr>
               <w:pStyle w:val="24"/>
               <w:spacing w:before="0" w:after="0" w:line="312" w:lineRule="auto"/>
-              <w:jc w:val="center"/>
+              <w:jc w:val="left"/>
               <w:rPr>
                 <w:rFonts w:ascii="Times New Roman" w:hAnsi="Times New Roman" w:eastAsia="宋体" w:cs="Times New Roman"/>
                 <w:i w:val="0"/>
@@ -6639,7 +6783,7 @@
             <w:pPr>
               <w:pStyle w:val="24"/>
               <w:spacing w:before="0" w:after="0" w:line="312" w:lineRule="auto"/>
-              <w:jc w:val="center"/>
+              <w:jc w:val="left"/>
               <w:rPr>
                 <w:rFonts w:ascii="Times New Roman" w:hAnsi="Times New Roman" w:eastAsia="宋体" w:cs="Times New Roman"/>
                 <w:i w:val="0"/>
@@ -6685,7 +6829,7 @@
             <w:pPr>
               <w:pStyle w:val="24"/>
               <w:spacing w:before="0" w:after="0" w:line="312" w:lineRule="auto"/>
-              <w:jc w:val="center"/>
+              <w:jc w:val="left"/>
               <w:rPr>
                 <w:rFonts w:ascii="Times New Roman" w:hAnsi="Times New Roman" w:eastAsia="宋体" w:cs="Times New Roman"/>
                 <w:i w:val="0"/>
@@ -6713,7 +6857,7 @@
             <w:pPr>
               <w:pStyle w:val="24"/>
               <w:spacing w:before="0" w:after="0" w:line="312" w:lineRule="auto"/>
-              <w:jc w:val="center"/>
+              <w:jc w:val="left"/>
               <w:rPr>
                 <w:rFonts w:ascii="Times New Roman" w:hAnsi="Times New Roman" w:eastAsia="宋体" w:cs="Times New Roman"/>
                 <w:i w:val="0"/>
@@ -6738,7 +6882,7 @@
             <w:pPr>
               <w:pStyle w:val="24"/>
               <w:spacing w:before="0" w:after="0" w:line="312" w:lineRule="auto"/>
-              <w:jc w:val="center"/>
+              <w:jc w:val="left"/>
               <w:rPr>
                 <w:rFonts w:ascii="Times New Roman" w:hAnsi="Times New Roman" w:eastAsia="宋体" w:cs="Times New Roman"/>
                 <w:i w:val="0"/>
@@ -6763,7 +6907,7 @@
             <w:pPr>
               <w:pStyle w:val="24"/>
               <w:spacing w:before="0" w:after="0" w:line="312" w:lineRule="auto"/>
-              <w:jc w:val="center"/>
+              <w:jc w:val="left"/>
               <w:rPr>
                 <w:rFonts w:ascii="Times New Roman" w:hAnsi="Times New Roman" w:eastAsia="宋体" w:cs="Times New Roman"/>
                 <w:i w:val="0"/>
@@ -6788,7 +6932,7 @@
             <w:pPr>
               <w:pStyle w:val="24"/>
               <w:spacing w:before="0" w:after="0" w:line="312" w:lineRule="auto"/>
-              <w:jc w:val="center"/>
+              <w:jc w:val="left"/>
               <w:rPr>
                 <w:rFonts w:ascii="Times New Roman" w:hAnsi="Times New Roman" w:eastAsia="宋体" w:cs="Times New Roman"/>
                 <w:i w:val="0"/>
@@ -6841,7 +6985,7 @@
         <w:pStyle w:val="23"/>
         <w:spacing w:before="0" w:after="0" w:line="360" w:lineRule="auto"/>
         <w:ind w:firstLineChars="200"/>
-        <w:jc w:val="both"/>
+        <w:jc w:val="left"/>
         <w:rPr>
           <w:rFonts w:ascii="Times New Roman" w:hAnsi="Times New Roman" w:eastAsia="宋体" w:cs="Times New Roman"/>
           <w:i w:val="0"/>
@@ -6865,7 +7009,7 @@
         <w:pStyle w:val="3"/>
         <w:spacing w:before="0" w:after="0" w:line="360" w:lineRule="auto"/>
         <w:ind w:firstLineChars="200"/>
-        <w:jc w:val="both"/>
+        <w:jc w:val="left"/>
         <w:rPr>
           <w:rFonts w:ascii="Times New Roman" w:hAnsi="Times New Roman" w:eastAsia="宋体" w:cs="Times New Roman"/>
           <w:i w:val="0"/>
@@ -6889,7 +7033,7 @@
         <w:pStyle w:val="3"/>
         <w:spacing w:before="0" w:after="0" w:line="360" w:lineRule="auto"/>
         <w:ind w:firstLineChars="200"/>
-        <w:jc w:val="both"/>
+        <w:jc w:val="left"/>
         <w:rPr>
           <w:rFonts w:ascii="Times New Roman" w:hAnsi="Times New Roman" w:eastAsia="宋体" w:cs="Times New Roman"/>
           <w:i w:val="0"/>
@@ -6913,7 +7057,7 @@
         <w:pStyle w:val="3"/>
         <w:spacing w:before="0" w:after="0" w:line="360" w:lineRule="auto"/>
         <w:ind w:firstLineChars="200"/>
-        <w:jc w:val="both"/>
+        <w:jc w:val="left"/>
         <w:rPr>
           <w:rFonts w:ascii="Times New Roman" w:hAnsi="Times New Roman" w:eastAsia="宋体" w:cs="Times New Roman"/>
           <w:i w:val="0"/>
@@ -6937,7 +7081,7 @@
         <w:pStyle w:val="3"/>
         <w:spacing w:before="0" w:after="0" w:line="360" w:lineRule="auto"/>
         <w:ind w:firstLineChars="200"/>
-        <w:jc w:val="both"/>
+        <w:jc w:val="left"/>
         <w:rPr>
           <w:rFonts w:ascii="Times New Roman" w:hAnsi="Times New Roman" w:eastAsia="宋体" w:cs="Times New Roman"/>
           <w:i w:val="0"/>
@@ -6961,7 +7105,7 @@
         <w:pStyle w:val="3"/>
         <w:spacing w:before="0" w:after="0" w:line="360" w:lineRule="auto"/>
         <w:ind w:firstLineChars="200"/>
-        <w:jc w:val="both"/>
+        <w:jc w:val="left"/>
         <w:rPr>
           <w:rFonts w:ascii="Times New Roman" w:hAnsi="Times New Roman" w:eastAsia="宋体" w:cs="Times New Roman"/>
           <w:i w:val="0"/>
@@ -7012,7 +7156,7 @@
           <w:sz w:val="21"/>
         </w:rPr>
         <w:pict>
-          <v:rect id="_x0000_i1030" o:spt="1" style="height:1.5pt;width:0pt;" coordsize="21600,21600" o:hr="t" o:hrstd="t" o:hralign="center">
+          <v:rect id="_x0000_i1030" o:spt="1" style="height:1.5pt;width:0pt;" coordsize="21600,21600" o:hr="t" o:hrstd="t">
             <v:path/>
             <v:fill focussize="0,0"/>
             <v:stroke/>
@@ -7030,7 +7174,7 @@
       <w:pPr>
         <w:pStyle w:val="4"/>
         <w:spacing w:before="240" w:after="240" w:line="360" w:lineRule="auto"/>
-        <w:jc w:val="center"/>
+        <w:jc w:val="left"/>
         <w:rPr>
           <w:rFonts w:ascii="Times New Roman" w:hAnsi="Times New Roman" w:eastAsia="黑体" w:cs="Times New Roman"/>
           <w:i w:val="0"/>
@@ -7056,7 +7200,7 @@
         <w:pStyle w:val="23"/>
         <w:spacing w:before="0" w:after="0" w:line="360" w:lineRule="auto"/>
         <w:ind w:firstLineChars="200"/>
-        <w:jc w:val="both"/>
+        <w:jc w:val="left"/>
         <w:rPr>
           <w:rFonts w:ascii="Times New Roman" w:hAnsi="Times New Roman" w:eastAsia="宋体" w:cs="Times New Roman"/>
           <w:i w:val="0"/>
@@ -7080,7 +7224,7 @@
         <w:pStyle w:val="3"/>
         <w:spacing w:before="0" w:after="0" w:line="360" w:lineRule="auto"/>
         <w:ind w:firstLineChars="200"/>
-        <w:jc w:val="both"/>
+        <w:jc w:val="left"/>
         <w:rPr>
           <w:rFonts w:ascii="Times New Roman" w:hAnsi="Times New Roman" w:eastAsia="宋体" w:cs="Times New Roman"/>
           <w:i w:val="0"/>
@@ -7104,7 +7248,7 @@
         <w:pStyle w:val="3"/>
         <w:spacing w:before="0" w:after="0" w:line="360" w:lineRule="auto"/>
         <w:ind w:firstLineChars="200"/>
-        <w:jc w:val="both"/>
+        <w:jc w:val="left"/>
         <w:rPr>
           <w:rFonts w:ascii="Times New Roman" w:hAnsi="Times New Roman" w:eastAsia="宋体" w:cs="Times New Roman"/>
           <w:i w:val="0"/>
@@ -7128,7 +7272,7 @@
       <w:pPr>
         <w:pStyle w:val="4"/>
         <w:spacing w:before="240" w:after="240" w:line="360" w:lineRule="auto"/>
-        <w:jc w:val="center"/>
+        <w:jc w:val="left"/>
         <w:rPr>
           <w:rFonts w:ascii="Times New Roman" w:hAnsi="Times New Roman" w:eastAsia="黑体" w:cs="Times New Roman"/>
           <w:i w:val="0"/>
@@ -7170,7 +7314,19 @@
           <w:color w:val="auto"/>
           <w:sz w:val="21"/>
         </w:rPr>
-        <w:t>[1] WU Y, LI Z, WU Y, et al. StateFlow: Enhancing LLM Task-Solving through State-Driven Workflows[C]//Proceedings of the 2024 Conference on Empirical Methods in Natural Language Processing. 2024.</w:t>
+        <w:t xml:space="preserve">[1] </w:t>
+      </w:r>
+      <w:r>
+        <w:rPr>
+          <w:rFonts w:hint="eastAsia" w:ascii="Times New Roman" w:hAnsi="Times New Roman" w:eastAsia="宋体" w:cs="Times New Roman"/>
+          <w:i w:val="0"/>
+          <w:iCs w:val="0"/>
+          <w:color w:val="auto"/>
+          <w:sz w:val="21"/>
+          <w:szCs w:val="21"/>
+          <w:lang w:val="en-US" w:eastAsia="zh-CN" w:bidi="ar-SA"/>
+        </w:rPr>
+        <w:t>WU Y, YUE T, ZHANG S, et al. StateFlow: Enhancing LLM Task-Solving through State-Driven Workflows[J/OL]. arXiv preprint arXiv:2403.11322, 2024.</w:t>
       </w:r>
     </w:p>
     <w:p>
@@ -7204,21 +7360,30 @@
         <w:ind w:hangingChars="200"/>
         <w:jc w:val="left"/>
         <w:rPr>
-          <w:rFonts w:ascii="Times New Roman" w:hAnsi="Times New Roman" w:eastAsia="宋体" w:cs="Times New Roman"/>
-          <w:i w:val="0"/>
-          <w:iCs w:val="0"/>
-          <w:color w:val="auto"/>
-        </w:rPr>
-      </w:pPr>
-      <w:r>
-        <w:rPr>
-          <w:rFonts w:ascii="Times New Roman" w:hAnsi="Times New Roman" w:eastAsia="宋体" w:cs="Times New Roman"/>
-          <w:i w:val="0"/>
-          <w:iCs w:val="0"/>
-          <w:color w:val="auto"/>
-          <w:sz w:val="21"/>
-        </w:rPr>
-        <w:t>[3] ZHANG Z, ZHANG B, WANG J, et al. A Survey on the Memory Mechanism of Large Language Model based Agents[J]. ACM Transactions on Information Systems, 2025.</w:t>
+          <w:rFonts w:ascii="宋体" w:hAnsi="宋体" w:eastAsia="宋体" w:cs="宋体"/>
+          <w:sz w:val="24"/>
+          <w:szCs w:val="24"/>
+        </w:rPr>
+      </w:pPr>
+      <w:r>
+        <w:rPr>
+          <w:rFonts w:ascii="Times New Roman" w:hAnsi="Times New Roman" w:eastAsia="宋体" w:cs="Times New Roman"/>
+          <w:i w:val="0"/>
+          <w:iCs w:val="0"/>
+          <w:color w:val="auto"/>
+          <w:sz w:val="21"/>
+        </w:rPr>
+        <w:t>[3]</w:t>
+      </w:r>
+      <w:r>
+        <w:rPr>
+          <w:rFonts w:ascii="Times New Roman" w:hAnsi="Times New Roman" w:eastAsia="宋体" w:cs="Times New Roman"/>
+          <w:i w:val="0"/>
+          <w:iCs w:val="0"/>
+          <w:color w:val="auto"/>
+          <w:sz w:val="21"/>
+        </w:rPr>
+        <w:t xml:space="preserve"> ZHANG Z, BO X, MA C, et al. A Survey on the Memory Mechanism of Large Language Model based Agents[J]. ACM Transactions on Information Systems, 2025, 43(6): 155.</w:t>
       </w:r>
     </w:p>
     <w:p>
@@ -7255,14 +7420,18 @@
           <w:rFonts w:ascii="Times New Roman" w:hAnsi="Times New Roman" w:eastAsia="宋体" w:cs="Times New Roman"/>
           <w:i w:val="0"/>
           <w:iCs w:val="0"/>
-          <w:color w:val="auto"/>
-        </w:rPr>
-      </w:pPr>
-      <w:r>
-        <w:rPr>
-          <w:rFonts w:ascii="Times New Roman" w:hAnsi="Times New Roman" w:eastAsia="宋体" w:cs="Times New Roman"/>
-          <w:i w:val="0"/>
-          <w:iCs w:val="0"/>
+          <w:strike/>
+          <w:dstrike w:val="0"/>
+          <w:color w:val="auto"/>
+        </w:rPr>
+      </w:pPr>
+      <w:r>
+        <w:rPr>
+          <w:rFonts w:ascii="Times New Roman" w:hAnsi="Times New Roman" w:eastAsia="宋体" w:cs="Times New Roman"/>
+          <w:i w:val="0"/>
+          <w:iCs w:val="0"/>
+          <w:strike/>
+          <w:dstrike w:val="0"/>
           <w:color w:val="auto"/>
           <w:sz w:val="21"/>
         </w:rPr>
@@ -7280,17 +7449,28 @@
           <w:i w:val="0"/>
           <w:iCs w:val="0"/>
           <w:color w:val="auto"/>
-        </w:rPr>
-      </w:pPr>
-      <w:r>
-        <w:rPr>
-          <w:rFonts w:ascii="Times New Roman" w:hAnsi="Times New Roman" w:eastAsia="宋体" w:cs="Times New Roman"/>
-          <w:i w:val="0"/>
-          <w:iCs w:val="0"/>
-          <w:color w:val="auto"/>
-          <w:sz w:val="21"/>
-        </w:rPr>
-        <w:t>[6] 刘峰, 张明, 李刚. 基于DeepSeek大模型的BIM平台赋能研究[J]. 建筑工程技术与设计, 2025.</w:t>
+          <w:sz w:val="21"/>
+        </w:rPr>
+      </w:pPr>
+      <w:r>
+        <w:rPr>
+          <w:rFonts w:ascii="Times New Roman" w:hAnsi="Times New Roman" w:eastAsia="宋体" w:cs="Times New Roman"/>
+          <w:i w:val="0"/>
+          <w:iCs w:val="0"/>
+          <w:color w:val="auto"/>
+          <w:sz w:val="21"/>
+        </w:rPr>
+        <w:t xml:space="preserve">[6] </w:t>
+      </w:r>
+      <w:r>
+        <w:rPr>
+          <w:rFonts w:hint="eastAsia" w:ascii="Times New Roman" w:hAnsi="Times New Roman" w:eastAsia="宋体" w:cs="Times New Roman"/>
+          <w:i w:val="0"/>
+          <w:iCs w:val="0"/>
+          <w:color w:val="auto"/>
+          <w:sz w:val="21"/>
+        </w:rPr>
+        <w:t>刘峰, 李文钦, 顾问天, 李保林, 许炯明. DeepSeek赋能BIM工程管理平台的应用场景探索[J]. 土木建筑工程信息技术, 2025, 17(5): 68-74. DOI: 10.16670/j.cnki.cn11-5823/tu.2025.05.12</w:t>
       </w:r>
     </w:p>
     <w:p>
@@ -7304,6 +7484,7 @@
           <w:i w:val="0"/>
           <w:iCs w:val="0"/>
           <w:color w:val="auto"/>
+          <w:sz w:val="21"/>
         </w:rPr>
       </w:pPr>
       <w:r>
@@ -7338,7 +7519,19 @@
           <w:color w:val="auto"/>
           <w:sz w:val="21"/>
         </w:rPr>
-        <w:t>[8] LIU N F, LIN K, HEWITT J, et al. Lost in the Middle: How Language Models Use Long Contexts[J]. Transactions of the Association for Computational Linguistics, 2024.</w:t>
+        <w:t>[8] LIU N F, LIN K, HEWITT J, et al. Lost in the Mid</w:t>
+      </w:r>
+      <w:bookmarkStart w:id="43" w:name="_GoBack"/>
+      <w:bookmarkEnd w:id="43"/>
+      <w:r>
+        <w:rPr>
+          <w:rFonts w:ascii="Times New Roman" w:hAnsi="Times New Roman" w:eastAsia="宋体" w:cs="Times New Roman"/>
+          <w:i w:val="0"/>
+          <w:iCs w:val="0"/>
+          <w:color w:val="auto"/>
+          <w:sz w:val="21"/>
+        </w:rPr>
+        <w:t>dle: How Language Models Use Long Contexts[J]. Transactions of the Association for Computational Linguistics, 2024.</w:t>
       </w:r>
     </w:p>
     <w:p>
@@ -7351,14 +7544,18 @@
           <w:rFonts w:ascii="Times New Roman" w:hAnsi="Times New Roman" w:eastAsia="宋体" w:cs="Times New Roman"/>
           <w:i w:val="0"/>
           <w:iCs w:val="0"/>
-          <w:color w:val="auto"/>
-        </w:rPr>
-      </w:pPr>
-      <w:r>
-        <w:rPr>
-          <w:rFonts w:ascii="Times New Roman" w:hAnsi="Times New Roman" w:eastAsia="宋体" w:cs="Times New Roman"/>
-          <w:i w:val="0"/>
-          <w:iCs w:val="0"/>
+          <w:strike/>
+          <w:dstrike w:val="0"/>
+          <w:color w:val="auto"/>
+        </w:rPr>
+      </w:pPr>
+      <w:r>
+        <w:rPr>
+          <w:rFonts w:ascii="Times New Roman" w:hAnsi="Times New Roman" w:eastAsia="宋体" w:cs="Times New Roman"/>
+          <w:i w:val="0"/>
+          <w:iCs w:val="0"/>
+          <w:strike/>
+          <w:dstrike w:val="0"/>
           <w:color w:val="auto"/>
           <w:sz w:val="21"/>
         </w:rPr>
@@ -7489,7 +7686,7 @@
   <w:docDefaults>
     <w:rPrDefault>
       <w:rPr>
-        <w:rFonts w:asciiTheme="minorHAnsi" w:hAnsiTheme="minorHAnsi" w:eastAsiaTheme="minorEastAsia" w:cstheme="minorBidi"/>
+        <w:rFonts w:ascii="Times New Roman" w:hAnsi="Times New Roman" w:eastAsia="宋体" w:cs="Times New Roman"/>
       </w:rPr>
     </w:rPrDefault>
     <w:pPrDefault/>

</xml_diff>